<commit_message>
Create and save raw mets plot
</commit_message>
<xml_diff>
--- a/outputs/Table1.docx
+++ b/outputs/Table1.docx
@@ -1158,7 +1158,7 @@
                 <w:szCs w:val="22"/>
                 <w:color w:val="000000"/>
               </w:rPr>
-              <w:t xml:space="preserve">0.178 (Fisher)</w:t>
+              <w:t xml:space="preserve">0.182 (Fisher)</w:t>
             </w:r>
           </w:p>
         </w:tc>
@@ -4164,95 +4164,95 @@
                 <w:szCs w:val="22"/>
                 <w:color w:val="000000"/>
               </w:rPr>
-              <w:t xml:space="preserve">7.74 ± 0.864</w:t>
-            </w:r>
-          </w:p>
-        </w:tc>
-        <w:tc>
-          <w:tcPr>
-            <w:tcBorders>
-              <w:bottom w:val="none" w:sz="0" w:space="0" w:color="000000"/>
-              <w:top w:val="none" w:sz="0" w:space="0" w:color="000000"/>
-              <w:left w:val="none" w:sz="0" w:space="0" w:color="000000"/>
-              <w:right w:val="none" w:sz="0" w:space="0" w:color="000000"/>
-            </w:tcBorders>
-            <w:shd w:val="clear" w:color="auto" w:fill="FFFFFF"/>
-            <w:tcMar>
-              <w:top w:w="0" w:type="dxa"/>
-              <w:bottom w:w="0" w:type="dxa"/>
-              <w:left w:w="0" w:type="dxa"/>
-              <w:right w:w="0" w:type="dxa"/>
-            </w:tcMar>
-            <w:vAlign w:val="center"/>
-          </w:tcPr>
-          <w:p>
-            <w:pPr>
-              <w:pStyle w:val="Normal"/>
-              <w:jc w:val="center"/>
-              <w:pBdr>
-                <w:bottom w:val="none" w:sz="0" w:space="0" w:color="000000"/>
-                <w:top w:val="none" w:sz="0" w:space="0" w:color="000000"/>
-                <w:left w:val="none" w:sz="0" w:space="0" w:color="000000"/>
-                <w:right w:val="none" w:sz="0" w:space="0" w:color="000000"/>
-              </w:pBdr>
-              <w:spacing w:after="100" w:before="100" w:line="240"/>
-              <w:ind w:left="100" w:right="100" w:firstLine="0" w:firstLineChars="0"/>
-            </w:pPr>
-            <w:r>
-              <w:rPr>
-                <w:rFonts w:ascii="Helvetica" w:hAnsi="Helvetica" w:eastAsia="Helvetica" w:cs="Helvetica"/>
-                <w:i w:val="false"/>
-                <w:b w:val="false"/>
-                <w:u w:val="none"/>
-                <w:sz w:val="22"/>
-                <w:szCs w:val="22"/>
-                <w:color w:val="000000"/>
-              </w:rPr>
-              <w:t xml:space="preserve">7.00 ± 2.09</w:t>
-            </w:r>
-          </w:p>
-        </w:tc>
-        <w:tc>
-          <w:tcPr>
-            <w:tcBorders>
-              <w:bottom w:val="none" w:sz="0" w:space="0" w:color="000000"/>
-              <w:top w:val="none" w:sz="0" w:space="0" w:color="000000"/>
-              <w:left w:val="none" w:sz="0" w:space="0" w:color="000000"/>
-              <w:right w:val="none" w:sz="0" w:space="0" w:color="000000"/>
-            </w:tcBorders>
-            <w:shd w:val="clear" w:color="auto" w:fill="FFFFFF"/>
-            <w:tcMar>
-              <w:top w:w="0" w:type="dxa"/>
-              <w:bottom w:w="0" w:type="dxa"/>
-              <w:left w:w="0" w:type="dxa"/>
-              <w:right w:w="0" w:type="dxa"/>
-            </w:tcMar>
-            <w:vAlign w:val="center"/>
-          </w:tcPr>
-          <w:p>
-            <w:pPr>
-              <w:pStyle w:val="Normal"/>
-              <w:jc w:val="center"/>
-              <w:pBdr>
-                <w:bottom w:val="none" w:sz="0" w:space="0" w:color="000000"/>
-                <w:top w:val="none" w:sz="0" w:space="0" w:color="000000"/>
-                <w:left w:val="none" w:sz="0" w:space="0" w:color="000000"/>
-                <w:right w:val="none" w:sz="0" w:space="0" w:color="000000"/>
-              </w:pBdr>
-              <w:spacing w:after="100" w:before="100" w:line="240"/>
-              <w:ind w:left="100" w:right="100" w:firstLine="0" w:firstLineChars="0"/>
-            </w:pPr>
-            <w:r>
-              <w:rPr>
-                <w:rFonts w:ascii="Helvetica" w:hAnsi="Helvetica" w:eastAsia="Helvetica" w:cs="Helvetica"/>
-                <w:i w:val="false"/>
-                <w:b w:val="false"/>
-                <w:u w:val="none"/>
-                <w:sz w:val="22"/>
-                <w:szCs w:val="22"/>
-                <w:color w:val="000000"/>
-              </w:rPr>
-              <w:t xml:space="preserve">0.347 (Wilcoxon)</w:t>
+              <w:t xml:space="preserve">7.57 ± 0.843</w:t>
+            </w:r>
+          </w:p>
+        </w:tc>
+        <w:tc>
+          <w:tcPr>
+            <w:tcBorders>
+              <w:bottom w:val="none" w:sz="0" w:space="0" w:color="000000"/>
+              <w:top w:val="none" w:sz="0" w:space="0" w:color="000000"/>
+              <w:left w:val="none" w:sz="0" w:space="0" w:color="000000"/>
+              <w:right w:val="none" w:sz="0" w:space="0" w:color="000000"/>
+            </w:tcBorders>
+            <w:shd w:val="clear" w:color="auto" w:fill="FFFFFF"/>
+            <w:tcMar>
+              <w:top w:w="0" w:type="dxa"/>
+              <w:bottom w:w="0" w:type="dxa"/>
+              <w:left w:w="0" w:type="dxa"/>
+              <w:right w:w="0" w:type="dxa"/>
+            </w:tcMar>
+            <w:vAlign w:val="center"/>
+          </w:tcPr>
+          <w:p>
+            <w:pPr>
+              <w:pStyle w:val="Normal"/>
+              <w:jc w:val="center"/>
+              <w:pBdr>
+                <w:bottom w:val="none" w:sz="0" w:space="0" w:color="000000"/>
+                <w:top w:val="none" w:sz="0" w:space="0" w:color="000000"/>
+                <w:left w:val="none" w:sz="0" w:space="0" w:color="000000"/>
+                <w:right w:val="none" w:sz="0" w:space="0" w:color="000000"/>
+              </w:pBdr>
+              <w:spacing w:after="100" w:before="100" w:line="240"/>
+              <w:ind w:left="100" w:right="100" w:firstLine="0" w:firstLineChars="0"/>
+            </w:pPr>
+            <w:r>
+              <w:rPr>
+                <w:rFonts w:ascii="Helvetica" w:hAnsi="Helvetica" w:eastAsia="Helvetica" w:cs="Helvetica"/>
+                <w:i w:val="false"/>
+                <w:b w:val="false"/>
+                <w:u w:val="none"/>
+                <w:sz w:val="22"/>
+                <w:szCs w:val="22"/>
+                <w:color w:val="000000"/>
+              </w:rPr>
+              <w:t xml:space="preserve">6.78 ± 2.05</w:t>
+            </w:r>
+          </w:p>
+        </w:tc>
+        <w:tc>
+          <w:tcPr>
+            <w:tcBorders>
+              <w:bottom w:val="none" w:sz="0" w:space="0" w:color="000000"/>
+              <w:top w:val="none" w:sz="0" w:space="0" w:color="000000"/>
+              <w:left w:val="none" w:sz="0" w:space="0" w:color="000000"/>
+              <w:right w:val="none" w:sz="0" w:space="0" w:color="000000"/>
+            </w:tcBorders>
+            <w:shd w:val="clear" w:color="auto" w:fill="FFFFFF"/>
+            <w:tcMar>
+              <w:top w:w="0" w:type="dxa"/>
+              <w:bottom w:w="0" w:type="dxa"/>
+              <w:left w:w="0" w:type="dxa"/>
+              <w:right w:w="0" w:type="dxa"/>
+            </w:tcMar>
+            <w:vAlign w:val="center"/>
+          </w:tcPr>
+          <w:p>
+            <w:pPr>
+              <w:pStyle w:val="Normal"/>
+              <w:jc w:val="center"/>
+              <w:pBdr>
+                <w:bottom w:val="none" w:sz="0" w:space="0" w:color="000000"/>
+                <w:top w:val="none" w:sz="0" w:space="0" w:color="000000"/>
+                <w:left w:val="none" w:sz="0" w:space="0" w:color="000000"/>
+                <w:right w:val="none" w:sz="0" w:space="0" w:color="000000"/>
+              </w:pBdr>
+              <w:spacing w:after="100" w:before="100" w:line="240"/>
+              <w:ind w:left="100" w:right="100" w:firstLine="0" w:firstLineChars="0"/>
+            </w:pPr>
+            <w:r>
+              <w:rPr>
+                <w:rFonts w:ascii="Helvetica" w:hAnsi="Helvetica" w:eastAsia="Helvetica" w:cs="Helvetica"/>
+                <w:i w:val="false"/>
+                <w:b w:val="false"/>
+                <w:u w:val="none"/>
+                <w:sz w:val="22"/>
+                <w:szCs w:val="22"/>
+                <w:color w:val="000000"/>
+              </w:rPr>
+              <w:t xml:space="preserve">0.321 (Wilcoxon)</w:t>
             </w:r>
           </w:p>
         </w:tc>
@@ -4390,7 +4390,7 @@
                 <w:szCs w:val="22"/>
                 <w:color w:val="000000"/>
               </w:rPr>
-              <w:t xml:space="preserve">7.50 [6.25, 8.00]</w:t>
+              <w:t xml:space="preserve">7.00 [6.25, 8.00]</w:t>
             </w:r>
           </w:p>
         </w:tc>
@@ -4710,95 +4710,95 @@
                 <w:szCs w:val="22"/>
                 <w:color w:val="000000"/>
               </w:rPr>
-              <w:t xml:space="preserve">98.4 ± 1.72</w:t>
-            </w:r>
-          </w:p>
-        </w:tc>
-        <w:tc>
-          <w:tcPr>
-            <w:tcBorders>
-              <w:bottom w:val="none" w:sz="0" w:space="0" w:color="000000"/>
-              <w:top w:val="none" w:sz="0" w:space="0" w:color="000000"/>
-              <w:left w:val="none" w:sz="0" w:space="0" w:color="000000"/>
-              <w:right w:val="none" w:sz="0" w:space="0" w:color="000000"/>
-            </w:tcBorders>
-            <w:shd w:val="clear" w:color="auto" w:fill="FFFFFF"/>
-            <w:tcMar>
-              <w:top w:w="0" w:type="dxa"/>
-              <w:bottom w:w="0" w:type="dxa"/>
-              <w:left w:w="0" w:type="dxa"/>
-              <w:right w:w="0" w:type="dxa"/>
-            </w:tcMar>
-            <w:vAlign w:val="center"/>
-          </w:tcPr>
-          <w:p>
-            <w:pPr>
-              <w:pStyle w:val="Normal"/>
-              <w:jc w:val="center"/>
-              <w:pBdr>
-                <w:bottom w:val="none" w:sz="0" w:space="0" w:color="000000"/>
-                <w:top w:val="none" w:sz="0" w:space="0" w:color="000000"/>
-                <w:left w:val="none" w:sz="0" w:space="0" w:color="000000"/>
-                <w:right w:val="none" w:sz="0" w:space="0" w:color="000000"/>
-              </w:pBdr>
-              <w:spacing w:after="100" w:before="100" w:line="240"/>
-              <w:ind w:left="100" w:right="100" w:firstLine="0" w:firstLineChars="0"/>
-            </w:pPr>
-            <w:r>
-              <w:rPr>
-                <w:rFonts w:ascii="Helvetica" w:hAnsi="Helvetica" w:eastAsia="Helvetica" w:cs="Helvetica"/>
-                <w:i w:val="false"/>
-                <w:b w:val="false"/>
-                <w:u w:val="none"/>
-                <w:sz w:val="22"/>
-                <w:szCs w:val="22"/>
-                <w:color w:val="000000"/>
-              </w:rPr>
-              <w:t xml:space="preserve">97.7 ± 6.32</w:t>
-            </w:r>
-          </w:p>
-        </w:tc>
-        <w:tc>
-          <w:tcPr>
-            <w:tcBorders>
-              <w:bottom w:val="none" w:sz="0" w:space="0" w:color="000000"/>
-              <w:top w:val="none" w:sz="0" w:space="0" w:color="000000"/>
-              <w:left w:val="none" w:sz="0" w:space="0" w:color="000000"/>
-              <w:right w:val="none" w:sz="0" w:space="0" w:color="000000"/>
-            </w:tcBorders>
-            <w:shd w:val="clear" w:color="auto" w:fill="FFFFFF"/>
-            <w:tcMar>
-              <w:top w:w="0" w:type="dxa"/>
-              <w:bottom w:w="0" w:type="dxa"/>
-              <w:left w:w="0" w:type="dxa"/>
-              <w:right w:w="0" w:type="dxa"/>
-            </w:tcMar>
-            <w:vAlign w:val="center"/>
-          </w:tcPr>
-          <w:p>
-            <w:pPr>
-              <w:pStyle w:val="Normal"/>
-              <w:jc w:val="center"/>
-              <w:pBdr>
-                <w:bottom w:val="none" w:sz="0" w:space="0" w:color="000000"/>
-                <w:top w:val="none" w:sz="0" w:space="0" w:color="000000"/>
-                <w:left w:val="none" w:sz="0" w:space="0" w:color="000000"/>
-                <w:right w:val="none" w:sz="0" w:space="0" w:color="000000"/>
-              </w:pBdr>
-              <w:spacing w:after="100" w:before="100" w:line="240"/>
-              <w:ind w:left="100" w:right="100" w:firstLine="0" w:firstLineChars="0"/>
-            </w:pPr>
-            <w:r>
-              <w:rPr>
-                <w:rFonts w:ascii="Helvetica" w:hAnsi="Helvetica" w:eastAsia="Helvetica" w:cs="Helvetica"/>
-                <w:i w:val="false"/>
-                <w:b w:val="false"/>
-                <w:u w:val="none"/>
-                <w:sz w:val="22"/>
-                <w:szCs w:val="22"/>
-                <w:color w:val="000000"/>
-              </w:rPr>
-              <w:t xml:space="preserve">0.308 (Wilcoxon)</w:t>
+              <w:t xml:space="preserve">98.7 ± 1.61</w:t>
+            </w:r>
+          </w:p>
+        </w:tc>
+        <w:tc>
+          <w:tcPr>
+            <w:tcBorders>
+              <w:bottom w:val="none" w:sz="0" w:space="0" w:color="000000"/>
+              <w:top w:val="none" w:sz="0" w:space="0" w:color="000000"/>
+              <w:left w:val="none" w:sz="0" w:space="0" w:color="000000"/>
+              <w:right w:val="none" w:sz="0" w:space="0" w:color="000000"/>
+            </w:tcBorders>
+            <w:shd w:val="clear" w:color="auto" w:fill="FFFFFF"/>
+            <w:tcMar>
+              <w:top w:w="0" w:type="dxa"/>
+              <w:bottom w:w="0" w:type="dxa"/>
+              <w:left w:w="0" w:type="dxa"/>
+              <w:right w:w="0" w:type="dxa"/>
+            </w:tcMar>
+            <w:vAlign w:val="center"/>
+          </w:tcPr>
+          <w:p>
+            <w:pPr>
+              <w:pStyle w:val="Normal"/>
+              <w:jc w:val="center"/>
+              <w:pBdr>
+                <w:bottom w:val="none" w:sz="0" w:space="0" w:color="000000"/>
+                <w:top w:val="none" w:sz="0" w:space="0" w:color="000000"/>
+                <w:left w:val="none" w:sz="0" w:space="0" w:color="000000"/>
+                <w:right w:val="none" w:sz="0" w:space="0" w:color="000000"/>
+              </w:pBdr>
+              <w:spacing w:after="100" w:before="100" w:line="240"/>
+              <w:ind w:left="100" w:right="100" w:firstLine="0" w:firstLineChars="0"/>
+            </w:pPr>
+            <w:r>
+              <w:rPr>
+                <w:rFonts w:ascii="Helvetica" w:hAnsi="Helvetica" w:eastAsia="Helvetica" w:cs="Helvetica"/>
+                <w:i w:val="false"/>
+                <w:b w:val="false"/>
+                <w:u w:val="none"/>
+                <w:sz w:val="22"/>
+                <w:szCs w:val="22"/>
+                <w:color w:val="000000"/>
+              </w:rPr>
+              <w:t xml:space="preserve">98.3 ± 6.38</w:t>
+            </w:r>
+          </w:p>
+        </w:tc>
+        <w:tc>
+          <w:tcPr>
+            <w:tcBorders>
+              <w:bottom w:val="none" w:sz="0" w:space="0" w:color="000000"/>
+              <w:top w:val="none" w:sz="0" w:space="0" w:color="000000"/>
+              <w:left w:val="none" w:sz="0" w:space="0" w:color="000000"/>
+              <w:right w:val="none" w:sz="0" w:space="0" w:color="000000"/>
+            </w:tcBorders>
+            <w:shd w:val="clear" w:color="auto" w:fill="FFFFFF"/>
+            <w:tcMar>
+              <w:top w:w="0" w:type="dxa"/>
+              <w:bottom w:w="0" w:type="dxa"/>
+              <w:left w:w="0" w:type="dxa"/>
+              <w:right w:w="0" w:type="dxa"/>
+            </w:tcMar>
+            <w:vAlign w:val="center"/>
+          </w:tcPr>
+          <w:p>
+            <w:pPr>
+              <w:pStyle w:val="Normal"/>
+              <w:jc w:val="center"/>
+              <w:pBdr>
+                <w:bottom w:val="none" w:sz="0" w:space="0" w:color="000000"/>
+                <w:top w:val="none" w:sz="0" w:space="0" w:color="000000"/>
+                <w:left w:val="none" w:sz="0" w:space="0" w:color="000000"/>
+                <w:right w:val="none" w:sz="0" w:space="0" w:color="000000"/>
+              </w:pBdr>
+              <w:spacing w:after="100" w:before="100" w:line="240"/>
+              <w:ind w:left="100" w:right="100" w:firstLine="0" w:firstLineChars="0"/>
+            </w:pPr>
+            <w:r>
+              <w:rPr>
+                <w:rFonts w:ascii="Helvetica" w:hAnsi="Helvetica" w:eastAsia="Helvetica" w:cs="Helvetica"/>
+                <w:i w:val="false"/>
+                <w:b w:val="false"/>
+                <w:u w:val="none"/>
+                <w:sz w:val="22"/>
+                <w:szCs w:val="22"/>
+                <w:color w:val="000000"/>
+              </w:rPr>
+              <w:t xml:space="preserve">0.11 (Wilcoxon)</w:t>
             </w:r>
           </w:p>
         </w:tc>
@@ -4892,7 +4892,7 @@
                 <w:szCs w:val="22"/>
                 <w:color w:val="000000"/>
               </w:rPr>
-              <w:t xml:space="preserve">98.8 [97.1, 100]</w:t>
+              <w:t xml:space="preserve">100 [97.1, 100]</w:t>
             </w:r>
           </w:p>
         </w:tc>
@@ -4936,7 +4936,7 @@
                 <w:szCs w:val="22"/>
                 <w:color w:val="000000"/>
               </w:rPr>
-              <w:t xml:space="preserve">100 [98.4, 100]</w:t>
+              <w:t xml:space="preserve">100 [100, 100]</w:t>
             </w:r>
           </w:p>
         </w:tc>

</xml_diff>

<commit_message>
adjust for age and BMI
</commit_message>
<xml_diff>
--- a/outputs/Table1.docx
+++ b/outputs/Table1.docx
@@ -18,9 +18,9 @@
       </w:tblPr>
       <w:tblGrid>
         <w:gridCol w:w="6212"/>
+        <w:gridCol w:w="2246"/>
         <w:gridCol w:w="2001"/>
-        <w:gridCol w:w="2001"/>
-        <w:gridCol w:w="2061"/>
+        <w:gridCol w:w="2379"/>
       </w:tblGrid>
       <w:tr>
         <w:trPr>
@@ -1158,7 +1158,7 @@
                 <w:szCs w:val="22"/>
                 <w:color w:val="000000"/>
               </w:rPr>
-              <w:t xml:space="preserve">0.182 (Fisher)</w:t>
+              <w:t xml:space="preserve">0.177 (Fisher)</w:t>
             </w:r>
           </w:p>
         </w:tc>
@@ -3574,7 +3574,7 @@
                 <w:szCs w:val="22"/>
                 <w:color w:val="000000"/>
               </w:rPr>
-              <w:t xml:space="preserve">  School Year</w:t>
+              <w:t xml:space="preserve">  Non-Summer</w:t>
             </w:r>
           </w:p>
         </w:tc>
@@ -4164,7 +4164,7 @@
                 <w:szCs w:val="22"/>
                 <w:color w:val="000000"/>
               </w:rPr>
-              <w:t xml:space="preserve">7.57 ± 0.843</w:t>
+              <w:t xml:space="preserve">7.65 ± 1.07</w:t>
             </w:r>
           </w:p>
         </w:tc>
@@ -4252,7 +4252,7 @@
                 <w:szCs w:val="22"/>
                 <w:color w:val="000000"/>
               </w:rPr>
-              <w:t xml:space="preserve">0.321 (Wilcoxon)</w:t>
+              <w:t xml:space="preserve">0.308 (Wilcoxon)</w:t>
             </w:r>
           </w:p>
         </w:tc>
@@ -4710,7 +4710,7 @@
                 <w:szCs w:val="22"/>
                 <w:color w:val="000000"/>
               </w:rPr>
-              <w:t xml:space="preserve">98.7 ± 1.61</w:t>
+              <w:t xml:space="preserve">98.5 ± 2.09</w:t>
             </w:r>
           </w:p>
         </w:tc>
@@ -4798,7 +4798,7 @@
                 <w:szCs w:val="22"/>
                 <w:color w:val="000000"/>
               </w:rPr>
-              <w:t xml:space="preserve">0.11 (Wilcoxon)</w:t>
+              <w:t xml:space="preserve">0.103 (Wilcoxon)</w:t>
             </w:r>
           </w:p>
         </w:tc>
@@ -4811,6 +4811,2554 @@
         <w:tc>
           <w:tcPr>
             <w:tcBorders>
+              <w:bottom w:val="none" w:sz="0" w:space="0" w:color="000000"/>
+              <w:top w:val="none" w:sz="0" w:space="0" w:color="000000"/>
+              <w:left w:val="none" w:sz="0" w:space="0" w:color="000000"/>
+              <w:right w:val="none" w:sz="0" w:space="0" w:color="000000"/>
+            </w:tcBorders>
+            <w:shd w:val="clear" w:color="auto" w:fill="FFFFFF"/>
+            <w:tcMar>
+              <w:top w:w="0" w:type="dxa"/>
+              <w:bottom w:w="0" w:type="dxa"/>
+              <w:left w:w="0" w:type="dxa"/>
+              <w:right w:w="0" w:type="dxa"/>
+            </w:tcMar>
+            <w:vAlign w:val="center"/>
+          </w:tcPr>
+          <w:p>
+            <w:pPr>
+              <w:pStyle w:val="Normal"/>
+              <w:jc w:val="left"/>
+              <w:pBdr>
+                <w:bottom w:val="none" w:sz="0" w:space="0" w:color="000000"/>
+                <w:top w:val="none" w:sz="0" w:space="0" w:color="000000"/>
+                <w:left w:val="none" w:sz="0" w:space="0" w:color="000000"/>
+                <w:right w:val="none" w:sz="0" w:space="0" w:color="000000"/>
+              </w:pBdr>
+              <w:spacing w:after="100" w:before="100" w:line="240"/>
+              <w:ind w:left="100" w:right="100" w:firstLine="0" w:firstLineChars="0"/>
+            </w:pPr>
+            <w:r>
+              <w:rPr>
+                <w:rFonts w:ascii="Helvetica" w:hAnsi="Helvetica" w:eastAsia="Helvetica" w:cs="Helvetica"/>
+                <w:i w:val="false"/>
+                <w:b w:val="false"/>
+                <w:u w:val="none"/>
+                <w:sz w:val="22"/>
+                <w:szCs w:val="22"/>
+                <w:color w:val="000000"/>
+              </w:rPr>
+              <w:t xml:space="preserve">  Median [IQR]</w:t>
+            </w:r>
+          </w:p>
+        </w:tc>
+        <w:tc>
+          <w:tcPr>
+            <w:tcBorders>
+              <w:bottom w:val="none" w:sz="0" w:space="0" w:color="000000"/>
+              <w:top w:val="none" w:sz="0" w:space="0" w:color="000000"/>
+              <w:left w:val="none" w:sz="0" w:space="0" w:color="000000"/>
+              <w:right w:val="none" w:sz="0" w:space="0" w:color="000000"/>
+            </w:tcBorders>
+            <w:shd w:val="clear" w:color="auto" w:fill="FFFFFF"/>
+            <w:tcMar>
+              <w:top w:w="0" w:type="dxa"/>
+              <w:bottom w:w="0" w:type="dxa"/>
+              <w:left w:w="0" w:type="dxa"/>
+              <w:right w:w="0" w:type="dxa"/>
+            </w:tcMar>
+            <w:vAlign w:val="center"/>
+          </w:tcPr>
+          <w:p>
+            <w:pPr>
+              <w:pStyle w:val="Normal"/>
+              <w:jc w:val="center"/>
+              <w:pBdr>
+                <w:bottom w:val="none" w:sz="0" w:space="0" w:color="000000"/>
+                <w:top w:val="none" w:sz="0" w:space="0" w:color="000000"/>
+                <w:left w:val="none" w:sz="0" w:space="0" w:color="000000"/>
+                <w:right w:val="none" w:sz="0" w:space="0" w:color="000000"/>
+              </w:pBdr>
+              <w:spacing w:after="100" w:before="100" w:line="240"/>
+              <w:ind w:left="100" w:right="100" w:firstLine="0" w:firstLineChars="0"/>
+            </w:pPr>
+            <w:r>
+              <w:rPr>
+                <w:rFonts w:ascii="Helvetica" w:hAnsi="Helvetica" w:eastAsia="Helvetica" w:cs="Helvetica"/>
+                <w:i w:val="false"/>
+                <w:b w:val="false"/>
+                <w:u w:val="none"/>
+                <w:sz w:val="22"/>
+                <w:szCs w:val="22"/>
+                <w:color w:val="000000"/>
+              </w:rPr>
+              <w:t xml:space="preserve">100 [97.1, 100]</w:t>
+            </w:r>
+          </w:p>
+        </w:tc>
+        <w:tc>
+          <w:tcPr>
+            <w:tcBorders>
+              <w:bottom w:val="none" w:sz="0" w:space="0" w:color="000000"/>
+              <w:top w:val="none" w:sz="0" w:space="0" w:color="000000"/>
+              <w:left w:val="none" w:sz="0" w:space="0" w:color="000000"/>
+              <w:right w:val="none" w:sz="0" w:space="0" w:color="000000"/>
+            </w:tcBorders>
+            <w:shd w:val="clear" w:color="auto" w:fill="FFFFFF"/>
+            <w:tcMar>
+              <w:top w:w="0" w:type="dxa"/>
+              <w:bottom w:w="0" w:type="dxa"/>
+              <w:left w:w="0" w:type="dxa"/>
+              <w:right w:w="0" w:type="dxa"/>
+            </w:tcMar>
+            <w:vAlign w:val="center"/>
+          </w:tcPr>
+          <w:p>
+            <w:pPr>
+              <w:pStyle w:val="Normal"/>
+              <w:jc w:val="center"/>
+              <w:pBdr>
+                <w:bottom w:val="none" w:sz="0" w:space="0" w:color="000000"/>
+                <w:top w:val="none" w:sz="0" w:space="0" w:color="000000"/>
+                <w:left w:val="none" w:sz="0" w:space="0" w:color="000000"/>
+                <w:right w:val="none" w:sz="0" w:space="0" w:color="000000"/>
+              </w:pBdr>
+              <w:spacing w:after="100" w:before="100" w:line="240"/>
+              <w:ind w:left="100" w:right="100" w:firstLine="0" w:firstLineChars="0"/>
+            </w:pPr>
+            <w:r>
+              <w:rPr>
+                <w:rFonts w:ascii="Helvetica" w:hAnsi="Helvetica" w:eastAsia="Helvetica" w:cs="Helvetica"/>
+                <w:i w:val="false"/>
+                <w:b w:val="false"/>
+                <w:u w:val="none"/>
+                <w:sz w:val="22"/>
+                <w:szCs w:val="22"/>
+                <w:color w:val="000000"/>
+              </w:rPr>
+              <w:t xml:space="preserve">100 [100, 100]</w:t>
+            </w:r>
+          </w:p>
+        </w:tc>
+        <w:tc>
+          <w:tcPr>
+            <w:tcBorders>
+              <w:bottom w:val="none" w:sz="0" w:space="0" w:color="000000"/>
+              <w:top w:val="none" w:sz="0" w:space="0" w:color="000000"/>
+              <w:left w:val="none" w:sz="0" w:space="0" w:color="000000"/>
+              <w:right w:val="none" w:sz="0" w:space="0" w:color="000000"/>
+            </w:tcBorders>
+            <w:shd w:val="clear" w:color="auto" w:fill="FFFFFF"/>
+            <w:tcMar>
+              <w:top w:w="0" w:type="dxa"/>
+              <w:bottom w:w="0" w:type="dxa"/>
+              <w:left w:w="0" w:type="dxa"/>
+              <w:right w:w="0" w:type="dxa"/>
+            </w:tcMar>
+            <w:vAlign w:val="center"/>
+          </w:tcPr>
+          <w:p>
+            <w:pPr>
+              <w:pStyle w:val="Normal"/>
+              <w:jc w:val="center"/>
+              <w:pBdr>
+                <w:bottom w:val="none" w:sz="0" w:space="0" w:color="000000"/>
+                <w:top w:val="none" w:sz="0" w:space="0" w:color="000000"/>
+                <w:left w:val="none" w:sz="0" w:space="0" w:color="000000"/>
+                <w:right w:val="none" w:sz="0" w:space="0" w:color="000000"/>
+              </w:pBdr>
+              <w:spacing w:after="100" w:before="100" w:line="240"/>
+              <w:ind w:left="100" w:right="100" w:firstLine="0" w:firstLineChars="0"/>
+            </w:pPr>
+            <w:r>
+              <w:rPr>
+                <w:rFonts w:ascii="Helvetica" w:hAnsi="Helvetica" w:eastAsia="Helvetica" w:cs="Helvetica"/>
+                <w:i w:val="false"/>
+                <w:b w:val="false"/>
+                <w:u w:val="none"/>
+                <w:sz w:val="22"/>
+                <w:szCs w:val="22"/>
+                <w:color w:val="000000"/>
+              </w:rPr>
+              <w:t xml:space="preserve"/>
+            </w:r>
+          </w:p>
+        </w:tc>
+      </w:tr>
+      <w:tr>
+        <w:trPr>
+          <w:trHeight w:val="621" w:hRule="auto"/>
+        </w:trPr>
+        body27
+        <w:tc>
+          <w:tcPr>
+            <w:tcBorders>
+              <w:bottom w:val="none" w:sz="0" w:space="0" w:color="000000"/>
+              <w:top w:val="none" w:sz="0" w:space="0" w:color="000000"/>
+              <w:left w:val="none" w:sz="0" w:space="0" w:color="000000"/>
+              <w:right w:val="none" w:sz="0" w:space="0" w:color="000000"/>
+            </w:tcBorders>
+            <w:shd w:val="clear" w:color="auto" w:fill="FFFFFF"/>
+            <w:tcMar>
+              <w:top w:w="0" w:type="dxa"/>
+              <w:bottom w:w="0" w:type="dxa"/>
+              <w:left w:w="0" w:type="dxa"/>
+              <w:right w:w="0" w:type="dxa"/>
+            </w:tcMar>
+            <w:vAlign w:val="center"/>
+          </w:tcPr>
+          <w:p>
+            <w:pPr>
+              <w:pStyle w:val="Normal"/>
+              <w:jc w:val="left"/>
+              <w:pBdr>
+                <w:bottom w:val="none" w:sz="0" w:space="0" w:color="000000"/>
+                <w:top w:val="none" w:sz="0" w:space="0" w:color="000000"/>
+                <w:left w:val="none" w:sz="0" w:space="0" w:color="000000"/>
+                <w:right w:val="none" w:sz="0" w:space="0" w:color="000000"/>
+              </w:pBdr>
+              <w:spacing w:after="100" w:before="100" w:line="240"/>
+              <w:ind w:left="100" w:right="100" w:firstLine="0" w:firstLineChars="0"/>
+            </w:pPr>
+            <w:r>
+              <w:rPr>
+                <w:rFonts w:ascii="Helvetica" w:hAnsi="Helvetica" w:eastAsia="Helvetica" w:cs="Helvetica"/>
+                <w:i w:val="false"/>
+                <w:b w:val="true"/>
+                <w:u w:val="none"/>
+                <w:sz w:val="22"/>
+                <w:szCs w:val="22"/>
+                <w:color w:val="000000"/>
+              </w:rPr>
+              <w:t xml:space="preserve">Average Sleep Efficiency (%)</w:t>
+            </w:r>
+          </w:p>
+        </w:tc>
+        <w:tc>
+          <w:tcPr>
+            <w:tcBorders>
+              <w:bottom w:val="none" w:sz="0" w:space="0" w:color="000000"/>
+              <w:top w:val="none" w:sz="0" w:space="0" w:color="000000"/>
+              <w:left w:val="none" w:sz="0" w:space="0" w:color="000000"/>
+              <w:right w:val="none" w:sz="0" w:space="0" w:color="000000"/>
+            </w:tcBorders>
+            <w:shd w:val="clear" w:color="auto" w:fill="FFFFFF"/>
+            <w:tcMar>
+              <w:top w:w="0" w:type="dxa"/>
+              <w:bottom w:w="0" w:type="dxa"/>
+              <w:left w:w="0" w:type="dxa"/>
+              <w:right w:w="0" w:type="dxa"/>
+            </w:tcMar>
+            <w:vAlign w:val="center"/>
+          </w:tcPr>
+          <w:p>
+            <w:pPr>
+              <w:pStyle w:val="Normal"/>
+              <w:jc w:val="center"/>
+              <w:pBdr>
+                <w:bottom w:val="none" w:sz="0" w:space="0" w:color="000000"/>
+                <w:top w:val="none" w:sz="0" w:space="0" w:color="000000"/>
+                <w:left w:val="none" w:sz="0" w:space="0" w:color="000000"/>
+                <w:right w:val="none" w:sz="0" w:space="0" w:color="000000"/>
+              </w:pBdr>
+              <w:spacing w:after="100" w:before="100" w:line="240"/>
+              <w:ind w:left="100" w:right="100" w:firstLine="0" w:firstLineChars="0"/>
+            </w:pPr>
+            <w:r>
+              <w:rPr>
+                <w:rFonts w:ascii="Helvetica" w:hAnsi="Helvetica" w:eastAsia="Helvetica" w:cs="Helvetica"/>
+                <w:i w:val="false"/>
+                <w:b w:val="false"/>
+                <w:u w:val="none"/>
+                <w:sz w:val="22"/>
+                <w:szCs w:val="22"/>
+                <w:color w:val="000000"/>
+              </w:rPr>
+              <w:t xml:space="preserve"/>
+            </w:r>
+          </w:p>
+        </w:tc>
+        <w:tc>
+          <w:tcPr>
+            <w:tcBorders>
+              <w:bottom w:val="none" w:sz="0" w:space="0" w:color="000000"/>
+              <w:top w:val="none" w:sz="0" w:space="0" w:color="000000"/>
+              <w:left w:val="none" w:sz="0" w:space="0" w:color="000000"/>
+              <w:right w:val="none" w:sz="0" w:space="0" w:color="000000"/>
+            </w:tcBorders>
+            <w:shd w:val="clear" w:color="auto" w:fill="FFFFFF"/>
+            <w:tcMar>
+              <w:top w:w="0" w:type="dxa"/>
+              <w:bottom w:w="0" w:type="dxa"/>
+              <w:left w:w="0" w:type="dxa"/>
+              <w:right w:w="0" w:type="dxa"/>
+            </w:tcMar>
+            <w:vAlign w:val="center"/>
+          </w:tcPr>
+          <w:p>
+            <w:pPr>
+              <w:pStyle w:val="Normal"/>
+              <w:jc w:val="center"/>
+              <w:pBdr>
+                <w:bottom w:val="none" w:sz="0" w:space="0" w:color="000000"/>
+                <w:top w:val="none" w:sz="0" w:space="0" w:color="000000"/>
+                <w:left w:val="none" w:sz="0" w:space="0" w:color="000000"/>
+                <w:right w:val="none" w:sz="0" w:space="0" w:color="000000"/>
+              </w:pBdr>
+              <w:spacing w:after="100" w:before="100" w:line="240"/>
+              <w:ind w:left="100" w:right="100" w:firstLine="0" w:firstLineChars="0"/>
+            </w:pPr>
+            <w:r>
+              <w:rPr>
+                <w:rFonts w:ascii="Helvetica" w:hAnsi="Helvetica" w:eastAsia="Helvetica" w:cs="Helvetica"/>
+                <w:i w:val="false"/>
+                <w:b w:val="false"/>
+                <w:u w:val="none"/>
+                <w:sz w:val="22"/>
+                <w:szCs w:val="22"/>
+                <w:color w:val="000000"/>
+              </w:rPr>
+              <w:t xml:space="preserve"/>
+            </w:r>
+          </w:p>
+        </w:tc>
+        <w:tc>
+          <w:tcPr>
+            <w:tcBorders>
+              <w:bottom w:val="none" w:sz="0" w:space="0" w:color="000000"/>
+              <w:top w:val="none" w:sz="0" w:space="0" w:color="000000"/>
+              <w:left w:val="none" w:sz="0" w:space="0" w:color="000000"/>
+              <w:right w:val="none" w:sz="0" w:space="0" w:color="000000"/>
+            </w:tcBorders>
+            <w:shd w:val="clear" w:color="auto" w:fill="FFFFFF"/>
+            <w:tcMar>
+              <w:top w:w="0" w:type="dxa"/>
+              <w:bottom w:w="0" w:type="dxa"/>
+              <w:left w:w="0" w:type="dxa"/>
+              <w:right w:w="0" w:type="dxa"/>
+            </w:tcMar>
+            <w:vAlign w:val="center"/>
+          </w:tcPr>
+          <w:p>
+            <w:pPr>
+              <w:pStyle w:val="Normal"/>
+              <w:jc w:val="center"/>
+              <w:pBdr>
+                <w:bottom w:val="none" w:sz="0" w:space="0" w:color="000000"/>
+                <w:top w:val="none" w:sz="0" w:space="0" w:color="000000"/>
+                <w:left w:val="none" w:sz="0" w:space="0" w:color="000000"/>
+                <w:right w:val="none" w:sz="0" w:space="0" w:color="000000"/>
+              </w:pBdr>
+              <w:spacing w:after="100" w:before="100" w:line="240"/>
+              <w:ind w:left="100" w:right="100" w:firstLine="0" w:firstLineChars="0"/>
+            </w:pPr>
+            <w:r>
+              <w:rPr>
+                <w:rFonts w:ascii="Helvetica" w:hAnsi="Helvetica" w:eastAsia="Helvetica" w:cs="Helvetica"/>
+                <w:i w:val="false"/>
+                <w:b w:val="false"/>
+                <w:u w:val="none"/>
+                <w:sz w:val="22"/>
+                <w:szCs w:val="22"/>
+                <w:color w:val="000000"/>
+              </w:rPr>
+              <w:t xml:space="preserve"/>
+            </w:r>
+          </w:p>
+        </w:tc>
+      </w:tr>
+      <w:tr>
+        <w:trPr>
+          <w:trHeight w:val="616" w:hRule="auto"/>
+        </w:trPr>
+        body28
+        <w:tc>
+          <w:tcPr>
+            <w:tcBorders>
+              <w:bottom w:val="none" w:sz="0" w:space="0" w:color="000000"/>
+              <w:top w:val="none" w:sz="0" w:space="0" w:color="000000"/>
+              <w:left w:val="none" w:sz="0" w:space="0" w:color="000000"/>
+              <w:right w:val="none" w:sz="0" w:space="0" w:color="000000"/>
+            </w:tcBorders>
+            <w:shd w:val="clear" w:color="auto" w:fill="FFFFFF"/>
+            <w:tcMar>
+              <w:top w:w="0" w:type="dxa"/>
+              <w:bottom w:w="0" w:type="dxa"/>
+              <w:left w:w="0" w:type="dxa"/>
+              <w:right w:w="0" w:type="dxa"/>
+            </w:tcMar>
+            <w:vAlign w:val="center"/>
+          </w:tcPr>
+          <w:p>
+            <w:pPr>
+              <w:pStyle w:val="Normal"/>
+              <w:jc w:val="left"/>
+              <w:pBdr>
+                <w:bottom w:val="none" w:sz="0" w:space="0" w:color="000000"/>
+                <w:top w:val="none" w:sz="0" w:space="0" w:color="000000"/>
+                <w:left w:val="none" w:sz="0" w:space="0" w:color="000000"/>
+                <w:right w:val="none" w:sz="0" w:space="0" w:color="000000"/>
+              </w:pBdr>
+              <w:spacing w:after="100" w:before="100" w:line="240"/>
+              <w:ind w:left="100" w:right="100" w:firstLine="0" w:firstLineChars="0"/>
+            </w:pPr>
+            <w:r>
+              <w:rPr>
+                <w:rFonts w:ascii="Helvetica" w:hAnsi="Helvetica" w:eastAsia="Helvetica" w:cs="Helvetica"/>
+                <w:i w:val="false"/>
+                <w:b w:val="false"/>
+                <w:u w:val="none"/>
+                <w:sz w:val="22"/>
+                <w:szCs w:val="22"/>
+                <w:color w:val="000000"/>
+              </w:rPr>
+              <w:t xml:space="preserve">  Mean ± SD</w:t>
+            </w:r>
+          </w:p>
+        </w:tc>
+        <w:tc>
+          <w:tcPr>
+            <w:tcBorders>
+              <w:bottom w:val="none" w:sz="0" w:space="0" w:color="000000"/>
+              <w:top w:val="none" w:sz="0" w:space="0" w:color="000000"/>
+              <w:left w:val="none" w:sz="0" w:space="0" w:color="000000"/>
+              <w:right w:val="none" w:sz="0" w:space="0" w:color="000000"/>
+            </w:tcBorders>
+            <w:shd w:val="clear" w:color="auto" w:fill="FFFFFF"/>
+            <w:tcMar>
+              <w:top w:w="0" w:type="dxa"/>
+              <w:bottom w:w="0" w:type="dxa"/>
+              <w:left w:w="0" w:type="dxa"/>
+              <w:right w:w="0" w:type="dxa"/>
+            </w:tcMar>
+            <w:vAlign w:val="center"/>
+          </w:tcPr>
+          <w:p>
+            <w:pPr>
+              <w:pStyle w:val="Normal"/>
+              <w:jc w:val="center"/>
+              <w:pBdr>
+                <w:bottom w:val="none" w:sz="0" w:space="0" w:color="000000"/>
+                <w:top w:val="none" w:sz="0" w:space="0" w:color="000000"/>
+                <w:left w:val="none" w:sz="0" w:space="0" w:color="000000"/>
+                <w:right w:val="none" w:sz="0" w:space="0" w:color="000000"/>
+              </w:pBdr>
+              <w:spacing w:after="100" w:before="100" w:line="240"/>
+              <w:ind w:left="100" w:right="100" w:firstLine="0" w:firstLineChars="0"/>
+            </w:pPr>
+            <w:r>
+              <w:rPr>
+                <w:rFonts w:ascii="Helvetica" w:hAnsi="Helvetica" w:eastAsia="Helvetica" w:cs="Helvetica"/>
+                <w:i w:val="false"/>
+                <w:b w:val="false"/>
+                <w:u w:val="none"/>
+                <w:sz w:val="22"/>
+                <w:szCs w:val="22"/>
+                <w:color w:val="000000"/>
+              </w:rPr>
+              <w:t xml:space="preserve">83.8 ± 4.19</w:t>
+            </w:r>
+          </w:p>
+        </w:tc>
+        <w:tc>
+          <w:tcPr>
+            <w:tcBorders>
+              <w:bottom w:val="none" w:sz="0" w:space="0" w:color="000000"/>
+              <w:top w:val="none" w:sz="0" w:space="0" w:color="000000"/>
+              <w:left w:val="none" w:sz="0" w:space="0" w:color="000000"/>
+              <w:right w:val="none" w:sz="0" w:space="0" w:color="000000"/>
+            </w:tcBorders>
+            <w:shd w:val="clear" w:color="auto" w:fill="FFFFFF"/>
+            <w:tcMar>
+              <w:top w:w="0" w:type="dxa"/>
+              <w:bottom w:w="0" w:type="dxa"/>
+              <w:left w:w="0" w:type="dxa"/>
+              <w:right w:w="0" w:type="dxa"/>
+            </w:tcMar>
+            <w:vAlign w:val="center"/>
+          </w:tcPr>
+          <w:p>
+            <w:pPr>
+              <w:pStyle w:val="Normal"/>
+              <w:jc w:val="center"/>
+              <w:pBdr>
+                <w:bottom w:val="none" w:sz="0" w:space="0" w:color="000000"/>
+                <w:top w:val="none" w:sz="0" w:space="0" w:color="000000"/>
+                <w:left w:val="none" w:sz="0" w:space="0" w:color="000000"/>
+                <w:right w:val="none" w:sz="0" w:space="0" w:color="000000"/>
+              </w:pBdr>
+              <w:spacing w:after="100" w:before="100" w:line="240"/>
+              <w:ind w:left="100" w:right="100" w:firstLine="0" w:firstLineChars="0"/>
+            </w:pPr>
+            <w:r>
+              <w:rPr>
+                <w:rFonts w:ascii="Helvetica" w:hAnsi="Helvetica" w:eastAsia="Helvetica" w:cs="Helvetica"/>
+                <w:i w:val="false"/>
+                <w:b w:val="false"/>
+                <w:u w:val="none"/>
+                <w:sz w:val="22"/>
+                <w:szCs w:val="22"/>
+                <w:color w:val="000000"/>
+              </w:rPr>
+              <w:t xml:space="preserve">84.8 ± 3.14</w:t>
+            </w:r>
+          </w:p>
+        </w:tc>
+        <w:tc>
+          <w:tcPr>
+            <w:tcBorders>
+              <w:bottom w:val="none" w:sz="0" w:space="0" w:color="000000"/>
+              <w:top w:val="none" w:sz="0" w:space="0" w:color="000000"/>
+              <w:left w:val="none" w:sz="0" w:space="0" w:color="000000"/>
+              <w:right w:val="none" w:sz="0" w:space="0" w:color="000000"/>
+            </w:tcBorders>
+            <w:shd w:val="clear" w:color="auto" w:fill="FFFFFF"/>
+            <w:tcMar>
+              <w:top w:w="0" w:type="dxa"/>
+              <w:bottom w:w="0" w:type="dxa"/>
+              <w:left w:w="0" w:type="dxa"/>
+              <w:right w:w="0" w:type="dxa"/>
+            </w:tcMar>
+            <w:vAlign w:val="center"/>
+          </w:tcPr>
+          <w:p>
+            <w:pPr>
+              <w:pStyle w:val="Normal"/>
+              <w:jc w:val="center"/>
+              <w:pBdr>
+                <w:bottom w:val="none" w:sz="0" w:space="0" w:color="000000"/>
+                <w:top w:val="none" w:sz="0" w:space="0" w:color="000000"/>
+                <w:left w:val="none" w:sz="0" w:space="0" w:color="000000"/>
+                <w:right w:val="none" w:sz="0" w:space="0" w:color="000000"/>
+              </w:pBdr>
+              <w:spacing w:after="100" w:before="100" w:line="240"/>
+              <w:ind w:left="100" w:right="100" w:firstLine="0" w:firstLineChars="0"/>
+            </w:pPr>
+            <w:r>
+              <w:rPr>
+                <w:rFonts w:ascii="Helvetica" w:hAnsi="Helvetica" w:eastAsia="Helvetica" w:cs="Helvetica"/>
+                <w:i w:val="false"/>
+                <w:b w:val="false"/>
+                <w:u w:val="none"/>
+                <w:sz w:val="22"/>
+                <w:szCs w:val="22"/>
+                <w:color w:val="000000"/>
+              </w:rPr>
+              <w:t xml:space="preserve">0.46 (t-test)</w:t>
+            </w:r>
+          </w:p>
+        </w:tc>
+      </w:tr>
+      <w:tr>
+        <w:trPr>
+          <w:trHeight w:val="616" w:hRule="auto"/>
+        </w:trPr>
+        body29
+        <w:tc>
+          <w:tcPr>
+            <w:tcBorders>
+              <w:bottom w:val="none" w:sz="0" w:space="0" w:color="000000"/>
+              <w:top w:val="none" w:sz="0" w:space="0" w:color="000000"/>
+              <w:left w:val="none" w:sz="0" w:space="0" w:color="000000"/>
+              <w:right w:val="none" w:sz="0" w:space="0" w:color="000000"/>
+            </w:tcBorders>
+            <w:shd w:val="clear" w:color="auto" w:fill="FFFFFF"/>
+            <w:tcMar>
+              <w:top w:w="0" w:type="dxa"/>
+              <w:bottom w:w="0" w:type="dxa"/>
+              <w:left w:w="0" w:type="dxa"/>
+              <w:right w:w="0" w:type="dxa"/>
+            </w:tcMar>
+            <w:vAlign w:val="center"/>
+          </w:tcPr>
+          <w:p>
+            <w:pPr>
+              <w:pStyle w:val="Normal"/>
+              <w:jc w:val="left"/>
+              <w:pBdr>
+                <w:bottom w:val="none" w:sz="0" w:space="0" w:color="000000"/>
+                <w:top w:val="none" w:sz="0" w:space="0" w:color="000000"/>
+                <w:left w:val="none" w:sz="0" w:space="0" w:color="000000"/>
+                <w:right w:val="none" w:sz="0" w:space="0" w:color="000000"/>
+              </w:pBdr>
+              <w:spacing w:after="100" w:before="100" w:line="240"/>
+              <w:ind w:left="100" w:right="100" w:firstLine="0" w:firstLineChars="0"/>
+            </w:pPr>
+            <w:r>
+              <w:rPr>
+                <w:rFonts w:ascii="Helvetica" w:hAnsi="Helvetica" w:eastAsia="Helvetica" w:cs="Helvetica"/>
+                <w:i w:val="false"/>
+                <w:b w:val="false"/>
+                <w:u w:val="none"/>
+                <w:sz w:val="22"/>
+                <w:szCs w:val="22"/>
+                <w:color w:val="000000"/>
+              </w:rPr>
+              <w:t xml:space="preserve">  Median [IQR]</w:t>
+            </w:r>
+          </w:p>
+        </w:tc>
+        <w:tc>
+          <w:tcPr>
+            <w:tcBorders>
+              <w:bottom w:val="none" w:sz="0" w:space="0" w:color="000000"/>
+              <w:top w:val="none" w:sz="0" w:space="0" w:color="000000"/>
+              <w:left w:val="none" w:sz="0" w:space="0" w:color="000000"/>
+              <w:right w:val="none" w:sz="0" w:space="0" w:color="000000"/>
+            </w:tcBorders>
+            <w:shd w:val="clear" w:color="auto" w:fill="FFFFFF"/>
+            <w:tcMar>
+              <w:top w:w="0" w:type="dxa"/>
+              <w:bottom w:w="0" w:type="dxa"/>
+              <w:left w:w="0" w:type="dxa"/>
+              <w:right w:w="0" w:type="dxa"/>
+            </w:tcMar>
+            <w:vAlign w:val="center"/>
+          </w:tcPr>
+          <w:p>
+            <w:pPr>
+              <w:pStyle w:val="Normal"/>
+              <w:jc w:val="center"/>
+              <w:pBdr>
+                <w:bottom w:val="none" w:sz="0" w:space="0" w:color="000000"/>
+                <w:top w:val="none" w:sz="0" w:space="0" w:color="000000"/>
+                <w:left w:val="none" w:sz="0" w:space="0" w:color="000000"/>
+                <w:right w:val="none" w:sz="0" w:space="0" w:color="000000"/>
+              </w:pBdr>
+              <w:spacing w:after="100" w:before="100" w:line="240"/>
+              <w:ind w:left="100" w:right="100" w:firstLine="0" w:firstLineChars="0"/>
+            </w:pPr>
+            <w:r>
+              <w:rPr>
+                <w:rFonts w:ascii="Helvetica" w:hAnsi="Helvetica" w:eastAsia="Helvetica" w:cs="Helvetica"/>
+                <w:i w:val="false"/>
+                <w:b w:val="false"/>
+                <w:u w:val="none"/>
+                <w:sz w:val="22"/>
+                <w:szCs w:val="22"/>
+                <w:color w:val="000000"/>
+              </w:rPr>
+              <w:t xml:space="preserve">84.1 [81.4, 85.5]</w:t>
+            </w:r>
+          </w:p>
+        </w:tc>
+        <w:tc>
+          <w:tcPr>
+            <w:tcBorders>
+              <w:bottom w:val="none" w:sz="0" w:space="0" w:color="000000"/>
+              <w:top w:val="none" w:sz="0" w:space="0" w:color="000000"/>
+              <w:left w:val="none" w:sz="0" w:space="0" w:color="000000"/>
+              <w:right w:val="none" w:sz="0" w:space="0" w:color="000000"/>
+            </w:tcBorders>
+            <w:shd w:val="clear" w:color="auto" w:fill="FFFFFF"/>
+            <w:tcMar>
+              <w:top w:w="0" w:type="dxa"/>
+              <w:bottom w:w="0" w:type="dxa"/>
+              <w:left w:w="0" w:type="dxa"/>
+              <w:right w:w="0" w:type="dxa"/>
+            </w:tcMar>
+            <w:vAlign w:val="center"/>
+          </w:tcPr>
+          <w:p>
+            <w:pPr>
+              <w:pStyle w:val="Normal"/>
+              <w:jc w:val="center"/>
+              <w:pBdr>
+                <w:bottom w:val="none" w:sz="0" w:space="0" w:color="000000"/>
+                <w:top w:val="none" w:sz="0" w:space="0" w:color="000000"/>
+                <w:left w:val="none" w:sz="0" w:space="0" w:color="000000"/>
+                <w:right w:val="none" w:sz="0" w:space="0" w:color="000000"/>
+              </w:pBdr>
+              <w:spacing w:after="100" w:before="100" w:line="240"/>
+              <w:ind w:left="100" w:right="100" w:firstLine="0" w:firstLineChars="0"/>
+            </w:pPr>
+            <w:r>
+              <w:rPr>
+                <w:rFonts w:ascii="Helvetica" w:hAnsi="Helvetica" w:eastAsia="Helvetica" w:cs="Helvetica"/>
+                <w:i w:val="false"/>
+                <w:b w:val="false"/>
+                <w:u w:val="none"/>
+                <w:sz w:val="22"/>
+                <w:szCs w:val="22"/>
+                <w:color w:val="000000"/>
+              </w:rPr>
+              <w:t xml:space="preserve">84.5 [83.3, 87.0]</w:t>
+            </w:r>
+          </w:p>
+        </w:tc>
+        <w:tc>
+          <w:tcPr>
+            <w:tcBorders>
+              <w:bottom w:val="none" w:sz="0" w:space="0" w:color="000000"/>
+              <w:top w:val="none" w:sz="0" w:space="0" w:color="000000"/>
+              <w:left w:val="none" w:sz="0" w:space="0" w:color="000000"/>
+              <w:right w:val="none" w:sz="0" w:space="0" w:color="000000"/>
+            </w:tcBorders>
+            <w:shd w:val="clear" w:color="auto" w:fill="FFFFFF"/>
+            <w:tcMar>
+              <w:top w:w="0" w:type="dxa"/>
+              <w:bottom w:w="0" w:type="dxa"/>
+              <w:left w:w="0" w:type="dxa"/>
+              <w:right w:w="0" w:type="dxa"/>
+            </w:tcMar>
+            <w:vAlign w:val="center"/>
+          </w:tcPr>
+          <w:p>
+            <w:pPr>
+              <w:pStyle w:val="Normal"/>
+              <w:jc w:val="center"/>
+              <w:pBdr>
+                <w:bottom w:val="none" w:sz="0" w:space="0" w:color="000000"/>
+                <w:top w:val="none" w:sz="0" w:space="0" w:color="000000"/>
+                <w:left w:val="none" w:sz="0" w:space="0" w:color="000000"/>
+                <w:right w:val="none" w:sz="0" w:space="0" w:color="000000"/>
+              </w:pBdr>
+              <w:spacing w:after="100" w:before="100" w:line="240"/>
+              <w:ind w:left="100" w:right="100" w:firstLine="0" w:firstLineChars="0"/>
+            </w:pPr>
+            <w:r>
+              <w:rPr>
+                <w:rFonts w:ascii="Helvetica" w:hAnsi="Helvetica" w:eastAsia="Helvetica" w:cs="Helvetica"/>
+                <w:i w:val="false"/>
+                <w:b w:val="false"/>
+                <w:u w:val="none"/>
+                <w:sz w:val="22"/>
+                <w:szCs w:val="22"/>
+                <w:color w:val="000000"/>
+              </w:rPr>
+              <w:t xml:space="preserve"/>
+            </w:r>
+          </w:p>
+        </w:tc>
+      </w:tr>
+      <w:tr>
+        <w:trPr>
+          <w:trHeight w:val="617" w:hRule="auto"/>
+        </w:trPr>
+        body30
+        <w:tc>
+          <w:tcPr>
+            <w:tcBorders>
+              <w:bottom w:val="none" w:sz="0" w:space="0" w:color="000000"/>
+              <w:top w:val="none" w:sz="0" w:space="0" w:color="000000"/>
+              <w:left w:val="none" w:sz="0" w:space="0" w:color="000000"/>
+              <w:right w:val="none" w:sz="0" w:space="0" w:color="000000"/>
+            </w:tcBorders>
+            <w:shd w:val="clear" w:color="auto" w:fill="FFFFFF"/>
+            <w:tcMar>
+              <w:top w:w="0" w:type="dxa"/>
+              <w:bottom w:w="0" w:type="dxa"/>
+              <w:left w:w="0" w:type="dxa"/>
+              <w:right w:w="0" w:type="dxa"/>
+            </w:tcMar>
+            <w:vAlign w:val="center"/>
+          </w:tcPr>
+          <w:p>
+            <w:pPr>
+              <w:pStyle w:val="Normal"/>
+              <w:jc w:val="left"/>
+              <w:pBdr>
+                <w:bottom w:val="none" w:sz="0" w:space="0" w:color="000000"/>
+                <w:top w:val="none" w:sz="0" w:space="0" w:color="000000"/>
+                <w:left w:val="none" w:sz="0" w:space="0" w:color="000000"/>
+                <w:right w:val="none" w:sz="0" w:space="0" w:color="000000"/>
+              </w:pBdr>
+              <w:spacing w:after="100" w:before="100" w:line="240"/>
+              <w:ind w:left="100" w:right="100" w:firstLine="0" w:firstLineChars="0"/>
+            </w:pPr>
+            <w:r>
+              <w:rPr>
+                <w:rFonts w:ascii="Helvetica" w:hAnsi="Helvetica" w:eastAsia="Helvetica" w:cs="Helvetica"/>
+                <w:i w:val="false"/>
+                <w:b w:val="false"/>
+                <w:u w:val="none"/>
+                <w:sz w:val="22"/>
+                <w:szCs w:val="22"/>
+                <w:color w:val="000000"/>
+              </w:rPr>
+              <w:t xml:space="preserve">  Missing</w:t>
+            </w:r>
+          </w:p>
+        </w:tc>
+        <w:tc>
+          <w:tcPr>
+            <w:tcBorders>
+              <w:bottom w:val="none" w:sz="0" w:space="0" w:color="000000"/>
+              <w:top w:val="none" w:sz="0" w:space="0" w:color="000000"/>
+              <w:left w:val="none" w:sz="0" w:space="0" w:color="000000"/>
+              <w:right w:val="none" w:sz="0" w:space="0" w:color="000000"/>
+            </w:tcBorders>
+            <w:shd w:val="clear" w:color="auto" w:fill="FFFFFF"/>
+            <w:tcMar>
+              <w:top w:w="0" w:type="dxa"/>
+              <w:bottom w:w="0" w:type="dxa"/>
+              <w:left w:w="0" w:type="dxa"/>
+              <w:right w:w="0" w:type="dxa"/>
+            </w:tcMar>
+            <w:vAlign w:val="center"/>
+          </w:tcPr>
+          <w:p>
+            <w:pPr>
+              <w:pStyle w:val="Normal"/>
+              <w:jc w:val="center"/>
+              <w:pBdr>
+                <w:bottom w:val="none" w:sz="0" w:space="0" w:color="000000"/>
+                <w:top w:val="none" w:sz="0" w:space="0" w:color="000000"/>
+                <w:left w:val="none" w:sz="0" w:space="0" w:color="000000"/>
+                <w:right w:val="none" w:sz="0" w:space="0" w:color="000000"/>
+              </w:pBdr>
+              <w:spacing w:after="100" w:before="100" w:line="240"/>
+              <w:ind w:left="100" w:right="100" w:firstLine="0" w:firstLineChars="0"/>
+            </w:pPr>
+            <w:r>
+              <w:rPr>
+                <w:rFonts w:ascii="Helvetica" w:hAnsi="Helvetica" w:eastAsia="Helvetica" w:cs="Helvetica"/>
+                <w:i w:val="false"/>
+                <w:b w:val="false"/>
+                <w:u w:val="none"/>
+                <w:sz w:val="22"/>
+                <w:szCs w:val="22"/>
+                <w:color w:val="000000"/>
+              </w:rPr>
+              <w:t xml:space="preserve">5 (21.7%)</w:t>
+            </w:r>
+          </w:p>
+        </w:tc>
+        <w:tc>
+          <w:tcPr>
+            <w:tcBorders>
+              <w:bottom w:val="none" w:sz="0" w:space="0" w:color="000000"/>
+              <w:top w:val="none" w:sz="0" w:space="0" w:color="000000"/>
+              <w:left w:val="none" w:sz="0" w:space="0" w:color="000000"/>
+              <w:right w:val="none" w:sz="0" w:space="0" w:color="000000"/>
+            </w:tcBorders>
+            <w:shd w:val="clear" w:color="auto" w:fill="FFFFFF"/>
+            <w:tcMar>
+              <w:top w:w="0" w:type="dxa"/>
+              <w:bottom w:w="0" w:type="dxa"/>
+              <w:left w:w="0" w:type="dxa"/>
+              <w:right w:w="0" w:type="dxa"/>
+            </w:tcMar>
+            <w:vAlign w:val="center"/>
+          </w:tcPr>
+          <w:p>
+            <w:pPr>
+              <w:pStyle w:val="Normal"/>
+              <w:jc w:val="center"/>
+              <w:pBdr>
+                <w:bottom w:val="none" w:sz="0" w:space="0" w:color="000000"/>
+                <w:top w:val="none" w:sz="0" w:space="0" w:color="000000"/>
+                <w:left w:val="none" w:sz="0" w:space="0" w:color="000000"/>
+                <w:right w:val="none" w:sz="0" w:space="0" w:color="000000"/>
+              </w:pBdr>
+              <w:spacing w:after="100" w:before="100" w:line="240"/>
+              <w:ind w:left="100" w:right="100" w:firstLine="0" w:firstLineChars="0"/>
+            </w:pPr>
+            <w:r>
+              <w:rPr>
+                <w:rFonts w:ascii="Helvetica" w:hAnsi="Helvetica" w:eastAsia="Helvetica" w:cs="Helvetica"/>
+                <w:i w:val="false"/>
+                <w:b w:val="false"/>
+                <w:u w:val="none"/>
+                <w:sz w:val="22"/>
+                <w:szCs w:val="22"/>
+                <w:color w:val="000000"/>
+              </w:rPr>
+              <w:t xml:space="preserve">4 (22.2%)</w:t>
+            </w:r>
+          </w:p>
+        </w:tc>
+        <w:tc>
+          <w:tcPr>
+            <w:tcBorders>
+              <w:bottom w:val="none" w:sz="0" w:space="0" w:color="000000"/>
+              <w:top w:val="none" w:sz="0" w:space="0" w:color="000000"/>
+              <w:left w:val="none" w:sz="0" w:space="0" w:color="000000"/>
+              <w:right w:val="none" w:sz="0" w:space="0" w:color="000000"/>
+            </w:tcBorders>
+            <w:shd w:val="clear" w:color="auto" w:fill="FFFFFF"/>
+            <w:tcMar>
+              <w:top w:w="0" w:type="dxa"/>
+              <w:bottom w:w="0" w:type="dxa"/>
+              <w:left w:w="0" w:type="dxa"/>
+              <w:right w:w="0" w:type="dxa"/>
+            </w:tcMar>
+            <w:vAlign w:val="center"/>
+          </w:tcPr>
+          <w:p>
+            <w:pPr>
+              <w:pStyle w:val="Normal"/>
+              <w:jc w:val="center"/>
+              <w:pBdr>
+                <w:bottom w:val="none" w:sz="0" w:space="0" w:color="000000"/>
+                <w:top w:val="none" w:sz="0" w:space="0" w:color="000000"/>
+                <w:left w:val="none" w:sz="0" w:space="0" w:color="000000"/>
+                <w:right w:val="none" w:sz="0" w:space="0" w:color="000000"/>
+              </w:pBdr>
+              <w:spacing w:after="100" w:before="100" w:line="240"/>
+              <w:ind w:left="100" w:right="100" w:firstLine="0" w:firstLineChars="0"/>
+            </w:pPr>
+            <w:r>
+              <w:rPr>
+                <w:rFonts w:ascii="Helvetica" w:hAnsi="Helvetica" w:eastAsia="Helvetica" w:cs="Helvetica"/>
+                <w:i w:val="false"/>
+                <w:b w:val="false"/>
+                <w:u w:val="none"/>
+                <w:sz w:val="22"/>
+                <w:szCs w:val="22"/>
+                <w:color w:val="000000"/>
+              </w:rPr>
+              <w:t xml:space="preserve"/>
+            </w:r>
+          </w:p>
+        </w:tc>
+      </w:tr>
+      <w:tr>
+        <w:trPr>
+          <w:trHeight w:val="621" w:hRule="auto"/>
+        </w:trPr>
+        body31
+        <w:tc>
+          <w:tcPr>
+            <w:tcBorders>
+              <w:bottom w:val="none" w:sz="0" w:space="0" w:color="000000"/>
+              <w:top w:val="none" w:sz="0" w:space="0" w:color="000000"/>
+              <w:left w:val="none" w:sz="0" w:space="0" w:color="000000"/>
+              <w:right w:val="none" w:sz="0" w:space="0" w:color="000000"/>
+            </w:tcBorders>
+            <w:shd w:val="clear" w:color="auto" w:fill="FFFFFF"/>
+            <w:tcMar>
+              <w:top w:w="0" w:type="dxa"/>
+              <w:bottom w:w="0" w:type="dxa"/>
+              <w:left w:w="0" w:type="dxa"/>
+              <w:right w:w="0" w:type="dxa"/>
+            </w:tcMar>
+            <w:vAlign w:val="center"/>
+          </w:tcPr>
+          <w:p>
+            <w:pPr>
+              <w:pStyle w:val="Normal"/>
+              <w:jc w:val="left"/>
+              <w:pBdr>
+                <w:bottom w:val="none" w:sz="0" w:space="0" w:color="000000"/>
+                <w:top w:val="none" w:sz="0" w:space="0" w:color="000000"/>
+                <w:left w:val="none" w:sz="0" w:space="0" w:color="000000"/>
+                <w:right w:val="none" w:sz="0" w:space="0" w:color="000000"/>
+              </w:pBdr>
+              <w:spacing w:after="100" w:before="100" w:line="240"/>
+              <w:ind w:left="100" w:right="100" w:firstLine="0" w:firstLineChars="0"/>
+            </w:pPr>
+            <w:r>
+              <w:rPr>
+                <w:rFonts w:ascii="Helvetica" w:hAnsi="Helvetica" w:eastAsia="Helvetica" w:cs="Helvetica"/>
+                <w:i w:val="false"/>
+                <w:b w:val="true"/>
+                <w:u w:val="none"/>
+                <w:sz w:val="22"/>
+                <w:szCs w:val="22"/>
+                <w:color w:val="000000"/>
+              </w:rPr>
+              <w:t xml:space="preserve">Average Wake After Sleep Onset (mins)</w:t>
+            </w:r>
+          </w:p>
+        </w:tc>
+        <w:tc>
+          <w:tcPr>
+            <w:tcBorders>
+              <w:bottom w:val="none" w:sz="0" w:space="0" w:color="000000"/>
+              <w:top w:val="none" w:sz="0" w:space="0" w:color="000000"/>
+              <w:left w:val="none" w:sz="0" w:space="0" w:color="000000"/>
+              <w:right w:val="none" w:sz="0" w:space="0" w:color="000000"/>
+            </w:tcBorders>
+            <w:shd w:val="clear" w:color="auto" w:fill="FFFFFF"/>
+            <w:tcMar>
+              <w:top w:w="0" w:type="dxa"/>
+              <w:bottom w:w="0" w:type="dxa"/>
+              <w:left w:w="0" w:type="dxa"/>
+              <w:right w:w="0" w:type="dxa"/>
+            </w:tcMar>
+            <w:vAlign w:val="center"/>
+          </w:tcPr>
+          <w:p>
+            <w:pPr>
+              <w:pStyle w:val="Normal"/>
+              <w:jc w:val="center"/>
+              <w:pBdr>
+                <w:bottom w:val="none" w:sz="0" w:space="0" w:color="000000"/>
+                <w:top w:val="none" w:sz="0" w:space="0" w:color="000000"/>
+                <w:left w:val="none" w:sz="0" w:space="0" w:color="000000"/>
+                <w:right w:val="none" w:sz="0" w:space="0" w:color="000000"/>
+              </w:pBdr>
+              <w:spacing w:after="100" w:before="100" w:line="240"/>
+              <w:ind w:left="100" w:right="100" w:firstLine="0" w:firstLineChars="0"/>
+            </w:pPr>
+            <w:r>
+              <w:rPr>
+                <w:rFonts w:ascii="Helvetica" w:hAnsi="Helvetica" w:eastAsia="Helvetica" w:cs="Helvetica"/>
+                <w:i w:val="false"/>
+                <w:b w:val="false"/>
+                <w:u w:val="none"/>
+                <w:sz w:val="22"/>
+                <w:szCs w:val="22"/>
+                <w:color w:val="000000"/>
+              </w:rPr>
+              <w:t xml:space="preserve"/>
+            </w:r>
+          </w:p>
+        </w:tc>
+        <w:tc>
+          <w:tcPr>
+            <w:tcBorders>
+              <w:bottom w:val="none" w:sz="0" w:space="0" w:color="000000"/>
+              <w:top w:val="none" w:sz="0" w:space="0" w:color="000000"/>
+              <w:left w:val="none" w:sz="0" w:space="0" w:color="000000"/>
+              <w:right w:val="none" w:sz="0" w:space="0" w:color="000000"/>
+            </w:tcBorders>
+            <w:shd w:val="clear" w:color="auto" w:fill="FFFFFF"/>
+            <w:tcMar>
+              <w:top w:w="0" w:type="dxa"/>
+              <w:bottom w:w="0" w:type="dxa"/>
+              <w:left w:w="0" w:type="dxa"/>
+              <w:right w:w="0" w:type="dxa"/>
+            </w:tcMar>
+            <w:vAlign w:val="center"/>
+          </w:tcPr>
+          <w:p>
+            <w:pPr>
+              <w:pStyle w:val="Normal"/>
+              <w:jc w:val="center"/>
+              <w:pBdr>
+                <w:bottom w:val="none" w:sz="0" w:space="0" w:color="000000"/>
+                <w:top w:val="none" w:sz="0" w:space="0" w:color="000000"/>
+                <w:left w:val="none" w:sz="0" w:space="0" w:color="000000"/>
+                <w:right w:val="none" w:sz="0" w:space="0" w:color="000000"/>
+              </w:pBdr>
+              <w:spacing w:after="100" w:before="100" w:line="240"/>
+              <w:ind w:left="100" w:right="100" w:firstLine="0" w:firstLineChars="0"/>
+            </w:pPr>
+            <w:r>
+              <w:rPr>
+                <w:rFonts w:ascii="Helvetica" w:hAnsi="Helvetica" w:eastAsia="Helvetica" w:cs="Helvetica"/>
+                <w:i w:val="false"/>
+                <w:b w:val="false"/>
+                <w:u w:val="none"/>
+                <w:sz w:val="22"/>
+                <w:szCs w:val="22"/>
+                <w:color w:val="000000"/>
+              </w:rPr>
+              <w:t xml:space="preserve"/>
+            </w:r>
+          </w:p>
+        </w:tc>
+        <w:tc>
+          <w:tcPr>
+            <w:tcBorders>
+              <w:bottom w:val="none" w:sz="0" w:space="0" w:color="000000"/>
+              <w:top w:val="none" w:sz="0" w:space="0" w:color="000000"/>
+              <w:left w:val="none" w:sz="0" w:space="0" w:color="000000"/>
+              <w:right w:val="none" w:sz="0" w:space="0" w:color="000000"/>
+            </w:tcBorders>
+            <w:shd w:val="clear" w:color="auto" w:fill="FFFFFF"/>
+            <w:tcMar>
+              <w:top w:w="0" w:type="dxa"/>
+              <w:bottom w:w="0" w:type="dxa"/>
+              <w:left w:w="0" w:type="dxa"/>
+              <w:right w:w="0" w:type="dxa"/>
+            </w:tcMar>
+            <w:vAlign w:val="center"/>
+          </w:tcPr>
+          <w:p>
+            <w:pPr>
+              <w:pStyle w:val="Normal"/>
+              <w:jc w:val="center"/>
+              <w:pBdr>
+                <w:bottom w:val="none" w:sz="0" w:space="0" w:color="000000"/>
+                <w:top w:val="none" w:sz="0" w:space="0" w:color="000000"/>
+                <w:left w:val="none" w:sz="0" w:space="0" w:color="000000"/>
+                <w:right w:val="none" w:sz="0" w:space="0" w:color="000000"/>
+              </w:pBdr>
+              <w:spacing w:after="100" w:before="100" w:line="240"/>
+              <w:ind w:left="100" w:right="100" w:firstLine="0" w:firstLineChars="0"/>
+            </w:pPr>
+            <w:r>
+              <w:rPr>
+                <w:rFonts w:ascii="Helvetica" w:hAnsi="Helvetica" w:eastAsia="Helvetica" w:cs="Helvetica"/>
+                <w:i w:val="false"/>
+                <w:b w:val="false"/>
+                <w:u w:val="none"/>
+                <w:sz w:val="22"/>
+                <w:szCs w:val="22"/>
+                <w:color w:val="000000"/>
+              </w:rPr>
+              <w:t xml:space="preserve"/>
+            </w:r>
+          </w:p>
+        </w:tc>
+      </w:tr>
+      <w:tr>
+        <w:trPr>
+          <w:trHeight w:val="616" w:hRule="auto"/>
+        </w:trPr>
+        body32
+        <w:tc>
+          <w:tcPr>
+            <w:tcBorders>
+              <w:bottom w:val="none" w:sz="0" w:space="0" w:color="000000"/>
+              <w:top w:val="none" w:sz="0" w:space="0" w:color="000000"/>
+              <w:left w:val="none" w:sz="0" w:space="0" w:color="000000"/>
+              <w:right w:val="none" w:sz="0" w:space="0" w:color="000000"/>
+            </w:tcBorders>
+            <w:shd w:val="clear" w:color="auto" w:fill="FFFFFF"/>
+            <w:tcMar>
+              <w:top w:w="0" w:type="dxa"/>
+              <w:bottom w:w="0" w:type="dxa"/>
+              <w:left w:w="0" w:type="dxa"/>
+              <w:right w:w="0" w:type="dxa"/>
+            </w:tcMar>
+            <w:vAlign w:val="center"/>
+          </w:tcPr>
+          <w:p>
+            <w:pPr>
+              <w:pStyle w:val="Normal"/>
+              <w:jc w:val="left"/>
+              <w:pBdr>
+                <w:bottom w:val="none" w:sz="0" w:space="0" w:color="000000"/>
+                <w:top w:val="none" w:sz="0" w:space="0" w:color="000000"/>
+                <w:left w:val="none" w:sz="0" w:space="0" w:color="000000"/>
+                <w:right w:val="none" w:sz="0" w:space="0" w:color="000000"/>
+              </w:pBdr>
+              <w:spacing w:after="100" w:before="100" w:line="240"/>
+              <w:ind w:left="100" w:right="100" w:firstLine="0" w:firstLineChars="0"/>
+            </w:pPr>
+            <w:r>
+              <w:rPr>
+                <w:rFonts w:ascii="Helvetica" w:hAnsi="Helvetica" w:eastAsia="Helvetica" w:cs="Helvetica"/>
+                <w:i w:val="false"/>
+                <w:b w:val="false"/>
+                <w:u w:val="none"/>
+                <w:sz w:val="22"/>
+                <w:szCs w:val="22"/>
+                <w:color w:val="000000"/>
+              </w:rPr>
+              <w:t xml:space="preserve">  Mean ± SD</w:t>
+            </w:r>
+          </w:p>
+        </w:tc>
+        <w:tc>
+          <w:tcPr>
+            <w:tcBorders>
+              <w:bottom w:val="none" w:sz="0" w:space="0" w:color="000000"/>
+              <w:top w:val="none" w:sz="0" w:space="0" w:color="000000"/>
+              <w:left w:val="none" w:sz="0" w:space="0" w:color="000000"/>
+              <w:right w:val="none" w:sz="0" w:space="0" w:color="000000"/>
+            </w:tcBorders>
+            <w:shd w:val="clear" w:color="auto" w:fill="FFFFFF"/>
+            <w:tcMar>
+              <w:top w:w="0" w:type="dxa"/>
+              <w:bottom w:w="0" w:type="dxa"/>
+              <w:left w:w="0" w:type="dxa"/>
+              <w:right w:w="0" w:type="dxa"/>
+            </w:tcMar>
+            <w:vAlign w:val="center"/>
+          </w:tcPr>
+          <w:p>
+            <w:pPr>
+              <w:pStyle w:val="Normal"/>
+              <w:jc w:val="center"/>
+              <w:pBdr>
+                <w:bottom w:val="none" w:sz="0" w:space="0" w:color="000000"/>
+                <w:top w:val="none" w:sz="0" w:space="0" w:color="000000"/>
+                <w:left w:val="none" w:sz="0" w:space="0" w:color="000000"/>
+                <w:right w:val="none" w:sz="0" w:space="0" w:color="000000"/>
+              </w:pBdr>
+              <w:spacing w:after="100" w:before="100" w:line="240"/>
+              <w:ind w:left="100" w:right="100" w:firstLine="0" w:firstLineChars="0"/>
+            </w:pPr>
+            <w:r>
+              <w:rPr>
+                <w:rFonts w:ascii="Helvetica" w:hAnsi="Helvetica" w:eastAsia="Helvetica" w:cs="Helvetica"/>
+                <w:i w:val="false"/>
+                <w:b w:val="false"/>
+                <w:u w:val="none"/>
+                <w:sz w:val="22"/>
+                <w:szCs w:val="22"/>
+                <w:color w:val="000000"/>
+              </w:rPr>
+              <w:t xml:space="preserve">52.9 ± 17.2</w:t>
+            </w:r>
+          </w:p>
+        </w:tc>
+        <w:tc>
+          <w:tcPr>
+            <w:tcBorders>
+              <w:bottom w:val="none" w:sz="0" w:space="0" w:color="000000"/>
+              <w:top w:val="none" w:sz="0" w:space="0" w:color="000000"/>
+              <w:left w:val="none" w:sz="0" w:space="0" w:color="000000"/>
+              <w:right w:val="none" w:sz="0" w:space="0" w:color="000000"/>
+            </w:tcBorders>
+            <w:shd w:val="clear" w:color="auto" w:fill="FFFFFF"/>
+            <w:tcMar>
+              <w:top w:w="0" w:type="dxa"/>
+              <w:bottom w:w="0" w:type="dxa"/>
+              <w:left w:w="0" w:type="dxa"/>
+              <w:right w:w="0" w:type="dxa"/>
+            </w:tcMar>
+            <w:vAlign w:val="center"/>
+          </w:tcPr>
+          <w:p>
+            <w:pPr>
+              <w:pStyle w:val="Normal"/>
+              <w:jc w:val="center"/>
+              <w:pBdr>
+                <w:bottom w:val="none" w:sz="0" w:space="0" w:color="000000"/>
+                <w:top w:val="none" w:sz="0" w:space="0" w:color="000000"/>
+                <w:left w:val="none" w:sz="0" w:space="0" w:color="000000"/>
+                <w:right w:val="none" w:sz="0" w:space="0" w:color="000000"/>
+              </w:pBdr>
+              <w:spacing w:after="100" w:before="100" w:line="240"/>
+              <w:ind w:left="100" w:right="100" w:firstLine="0" w:firstLineChars="0"/>
+            </w:pPr>
+            <w:r>
+              <w:rPr>
+                <w:rFonts w:ascii="Helvetica" w:hAnsi="Helvetica" w:eastAsia="Helvetica" w:cs="Helvetica"/>
+                <w:i w:val="false"/>
+                <w:b w:val="false"/>
+                <w:u w:val="none"/>
+                <w:sz w:val="22"/>
+                <w:szCs w:val="22"/>
+                <w:color w:val="000000"/>
+              </w:rPr>
+              <w:t xml:space="preserve">46.0 ± 15.6</w:t>
+            </w:r>
+          </w:p>
+        </w:tc>
+        <w:tc>
+          <w:tcPr>
+            <w:tcBorders>
+              <w:bottom w:val="none" w:sz="0" w:space="0" w:color="000000"/>
+              <w:top w:val="none" w:sz="0" w:space="0" w:color="000000"/>
+              <w:left w:val="none" w:sz="0" w:space="0" w:color="000000"/>
+              <w:right w:val="none" w:sz="0" w:space="0" w:color="000000"/>
+            </w:tcBorders>
+            <w:shd w:val="clear" w:color="auto" w:fill="FFFFFF"/>
+            <w:tcMar>
+              <w:top w:w="0" w:type="dxa"/>
+              <w:bottom w:w="0" w:type="dxa"/>
+              <w:left w:w="0" w:type="dxa"/>
+              <w:right w:w="0" w:type="dxa"/>
+            </w:tcMar>
+            <w:vAlign w:val="center"/>
+          </w:tcPr>
+          <w:p>
+            <w:pPr>
+              <w:pStyle w:val="Normal"/>
+              <w:jc w:val="center"/>
+              <w:pBdr>
+                <w:bottom w:val="none" w:sz="0" w:space="0" w:color="000000"/>
+                <w:top w:val="none" w:sz="0" w:space="0" w:color="000000"/>
+                <w:left w:val="none" w:sz="0" w:space="0" w:color="000000"/>
+                <w:right w:val="none" w:sz="0" w:space="0" w:color="000000"/>
+              </w:pBdr>
+              <w:spacing w:after="100" w:before="100" w:line="240"/>
+              <w:ind w:left="100" w:right="100" w:firstLine="0" w:firstLineChars="0"/>
+            </w:pPr>
+            <w:r>
+              <w:rPr>
+                <w:rFonts w:ascii="Helvetica" w:hAnsi="Helvetica" w:eastAsia="Helvetica" w:cs="Helvetica"/>
+                <w:i w:val="false"/>
+                <w:b w:val="false"/>
+                <w:u w:val="none"/>
+                <w:sz w:val="22"/>
+                <w:szCs w:val="22"/>
+                <w:color w:val="000000"/>
+              </w:rPr>
+              <w:t xml:space="preserve">0.249 (t-test)</w:t>
+            </w:r>
+          </w:p>
+        </w:tc>
+      </w:tr>
+      <w:tr>
+        <w:trPr>
+          <w:trHeight w:val="616" w:hRule="auto"/>
+        </w:trPr>
+        body33
+        <w:tc>
+          <w:tcPr>
+            <w:tcBorders>
+              <w:bottom w:val="none" w:sz="0" w:space="0" w:color="000000"/>
+              <w:top w:val="none" w:sz="0" w:space="0" w:color="000000"/>
+              <w:left w:val="none" w:sz="0" w:space="0" w:color="000000"/>
+              <w:right w:val="none" w:sz="0" w:space="0" w:color="000000"/>
+            </w:tcBorders>
+            <w:shd w:val="clear" w:color="auto" w:fill="FFFFFF"/>
+            <w:tcMar>
+              <w:top w:w="0" w:type="dxa"/>
+              <w:bottom w:w="0" w:type="dxa"/>
+              <w:left w:w="0" w:type="dxa"/>
+              <w:right w:w="0" w:type="dxa"/>
+            </w:tcMar>
+            <w:vAlign w:val="center"/>
+          </w:tcPr>
+          <w:p>
+            <w:pPr>
+              <w:pStyle w:val="Normal"/>
+              <w:jc w:val="left"/>
+              <w:pBdr>
+                <w:bottom w:val="none" w:sz="0" w:space="0" w:color="000000"/>
+                <w:top w:val="none" w:sz="0" w:space="0" w:color="000000"/>
+                <w:left w:val="none" w:sz="0" w:space="0" w:color="000000"/>
+                <w:right w:val="none" w:sz="0" w:space="0" w:color="000000"/>
+              </w:pBdr>
+              <w:spacing w:after="100" w:before="100" w:line="240"/>
+              <w:ind w:left="100" w:right="100" w:firstLine="0" w:firstLineChars="0"/>
+            </w:pPr>
+            <w:r>
+              <w:rPr>
+                <w:rFonts w:ascii="Helvetica" w:hAnsi="Helvetica" w:eastAsia="Helvetica" w:cs="Helvetica"/>
+                <w:i w:val="false"/>
+                <w:b w:val="false"/>
+                <w:u w:val="none"/>
+                <w:sz w:val="22"/>
+                <w:szCs w:val="22"/>
+                <w:color w:val="000000"/>
+              </w:rPr>
+              <w:t xml:space="preserve">  Median [IQR]</w:t>
+            </w:r>
+          </w:p>
+        </w:tc>
+        <w:tc>
+          <w:tcPr>
+            <w:tcBorders>
+              <w:bottom w:val="none" w:sz="0" w:space="0" w:color="000000"/>
+              <w:top w:val="none" w:sz="0" w:space="0" w:color="000000"/>
+              <w:left w:val="none" w:sz="0" w:space="0" w:color="000000"/>
+              <w:right w:val="none" w:sz="0" w:space="0" w:color="000000"/>
+            </w:tcBorders>
+            <w:shd w:val="clear" w:color="auto" w:fill="FFFFFF"/>
+            <w:tcMar>
+              <w:top w:w="0" w:type="dxa"/>
+              <w:bottom w:w="0" w:type="dxa"/>
+              <w:left w:w="0" w:type="dxa"/>
+              <w:right w:w="0" w:type="dxa"/>
+            </w:tcMar>
+            <w:vAlign w:val="center"/>
+          </w:tcPr>
+          <w:p>
+            <w:pPr>
+              <w:pStyle w:val="Normal"/>
+              <w:jc w:val="center"/>
+              <w:pBdr>
+                <w:bottom w:val="none" w:sz="0" w:space="0" w:color="000000"/>
+                <w:top w:val="none" w:sz="0" w:space="0" w:color="000000"/>
+                <w:left w:val="none" w:sz="0" w:space="0" w:color="000000"/>
+                <w:right w:val="none" w:sz="0" w:space="0" w:color="000000"/>
+              </w:pBdr>
+              <w:spacing w:after="100" w:before="100" w:line="240"/>
+              <w:ind w:left="100" w:right="100" w:firstLine="0" w:firstLineChars="0"/>
+            </w:pPr>
+            <w:r>
+              <w:rPr>
+                <w:rFonts w:ascii="Helvetica" w:hAnsi="Helvetica" w:eastAsia="Helvetica" w:cs="Helvetica"/>
+                <w:i w:val="false"/>
+                <w:b w:val="false"/>
+                <w:u w:val="none"/>
+                <w:sz w:val="22"/>
+                <w:szCs w:val="22"/>
+                <w:color w:val="000000"/>
+              </w:rPr>
+              <w:t xml:space="preserve">49.8 [43.3, 57.6]</w:t>
+            </w:r>
+          </w:p>
+        </w:tc>
+        <w:tc>
+          <w:tcPr>
+            <w:tcBorders>
+              <w:bottom w:val="none" w:sz="0" w:space="0" w:color="000000"/>
+              <w:top w:val="none" w:sz="0" w:space="0" w:color="000000"/>
+              <w:left w:val="none" w:sz="0" w:space="0" w:color="000000"/>
+              <w:right w:val="none" w:sz="0" w:space="0" w:color="000000"/>
+            </w:tcBorders>
+            <w:shd w:val="clear" w:color="auto" w:fill="FFFFFF"/>
+            <w:tcMar>
+              <w:top w:w="0" w:type="dxa"/>
+              <w:bottom w:w="0" w:type="dxa"/>
+              <w:left w:w="0" w:type="dxa"/>
+              <w:right w:w="0" w:type="dxa"/>
+            </w:tcMar>
+            <w:vAlign w:val="center"/>
+          </w:tcPr>
+          <w:p>
+            <w:pPr>
+              <w:pStyle w:val="Normal"/>
+              <w:jc w:val="center"/>
+              <w:pBdr>
+                <w:bottom w:val="none" w:sz="0" w:space="0" w:color="000000"/>
+                <w:top w:val="none" w:sz="0" w:space="0" w:color="000000"/>
+                <w:left w:val="none" w:sz="0" w:space="0" w:color="000000"/>
+                <w:right w:val="none" w:sz="0" w:space="0" w:color="000000"/>
+              </w:pBdr>
+              <w:spacing w:after="100" w:before="100" w:line="240"/>
+              <w:ind w:left="100" w:right="100" w:firstLine="0" w:firstLineChars="0"/>
+            </w:pPr>
+            <w:r>
+              <w:rPr>
+                <w:rFonts w:ascii="Helvetica" w:hAnsi="Helvetica" w:eastAsia="Helvetica" w:cs="Helvetica"/>
+                <w:i w:val="false"/>
+                <w:b w:val="false"/>
+                <w:u w:val="none"/>
+                <w:sz w:val="22"/>
+                <w:szCs w:val="22"/>
+                <w:color w:val="000000"/>
+              </w:rPr>
+              <w:t xml:space="preserve">47.6 [33.3, 54.4]</w:t>
+            </w:r>
+          </w:p>
+        </w:tc>
+        <w:tc>
+          <w:tcPr>
+            <w:tcBorders>
+              <w:bottom w:val="none" w:sz="0" w:space="0" w:color="000000"/>
+              <w:top w:val="none" w:sz="0" w:space="0" w:color="000000"/>
+              <w:left w:val="none" w:sz="0" w:space="0" w:color="000000"/>
+              <w:right w:val="none" w:sz="0" w:space="0" w:color="000000"/>
+            </w:tcBorders>
+            <w:shd w:val="clear" w:color="auto" w:fill="FFFFFF"/>
+            <w:tcMar>
+              <w:top w:w="0" w:type="dxa"/>
+              <w:bottom w:w="0" w:type="dxa"/>
+              <w:left w:w="0" w:type="dxa"/>
+              <w:right w:w="0" w:type="dxa"/>
+            </w:tcMar>
+            <w:vAlign w:val="center"/>
+          </w:tcPr>
+          <w:p>
+            <w:pPr>
+              <w:pStyle w:val="Normal"/>
+              <w:jc w:val="center"/>
+              <w:pBdr>
+                <w:bottom w:val="none" w:sz="0" w:space="0" w:color="000000"/>
+                <w:top w:val="none" w:sz="0" w:space="0" w:color="000000"/>
+                <w:left w:val="none" w:sz="0" w:space="0" w:color="000000"/>
+                <w:right w:val="none" w:sz="0" w:space="0" w:color="000000"/>
+              </w:pBdr>
+              <w:spacing w:after="100" w:before="100" w:line="240"/>
+              <w:ind w:left="100" w:right="100" w:firstLine="0" w:firstLineChars="0"/>
+            </w:pPr>
+            <w:r>
+              <w:rPr>
+                <w:rFonts w:ascii="Helvetica" w:hAnsi="Helvetica" w:eastAsia="Helvetica" w:cs="Helvetica"/>
+                <w:i w:val="false"/>
+                <w:b w:val="false"/>
+                <w:u w:val="none"/>
+                <w:sz w:val="22"/>
+                <w:szCs w:val="22"/>
+                <w:color w:val="000000"/>
+              </w:rPr>
+              <w:t xml:space="preserve"/>
+            </w:r>
+          </w:p>
+        </w:tc>
+      </w:tr>
+      <w:tr>
+        <w:trPr>
+          <w:trHeight w:val="617" w:hRule="auto"/>
+        </w:trPr>
+        body34
+        <w:tc>
+          <w:tcPr>
+            <w:tcBorders>
+              <w:bottom w:val="none" w:sz="0" w:space="0" w:color="000000"/>
+              <w:top w:val="none" w:sz="0" w:space="0" w:color="000000"/>
+              <w:left w:val="none" w:sz="0" w:space="0" w:color="000000"/>
+              <w:right w:val="none" w:sz="0" w:space="0" w:color="000000"/>
+            </w:tcBorders>
+            <w:shd w:val="clear" w:color="auto" w:fill="FFFFFF"/>
+            <w:tcMar>
+              <w:top w:w="0" w:type="dxa"/>
+              <w:bottom w:w="0" w:type="dxa"/>
+              <w:left w:w="0" w:type="dxa"/>
+              <w:right w:w="0" w:type="dxa"/>
+            </w:tcMar>
+            <w:vAlign w:val="center"/>
+          </w:tcPr>
+          <w:p>
+            <w:pPr>
+              <w:pStyle w:val="Normal"/>
+              <w:jc w:val="left"/>
+              <w:pBdr>
+                <w:bottom w:val="none" w:sz="0" w:space="0" w:color="000000"/>
+                <w:top w:val="none" w:sz="0" w:space="0" w:color="000000"/>
+                <w:left w:val="none" w:sz="0" w:space="0" w:color="000000"/>
+                <w:right w:val="none" w:sz="0" w:space="0" w:color="000000"/>
+              </w:pBdr>
+              <w:spacing w:after="100" w:before="100" w:line="240"/>
+              <w:ind w:left="100" w:right="100" w:firstLine="0" w:firstLineChars="0"/>
+            </w:pPr>
+            <w:r>
+              <w:rPr>
+                <w:rFonts w:ascii="Helvetica" w:hAnsi="Helvetica" w:eastAsia="Helvetica" w:cs="Helvetica"/>
+                <w:i w:val="false"/>
+                <w:b w:val="false"/>
+                <w:u w:val="none"/>
+                <w:sz w:val="22"/>
+                <w:szCs w:val="22"/>
+                <w:color w:val="000000"/>
+              </w:rPr>
+              <w:t xml:space="preserve">  Missing</w:t>
+            </w:r>
+          </w:p>
+        </w:tc>
+        <w:tc>
+          <w:tcPr>
+            <w:tcBorders>
+              <w:bottom w:val="none" w:sz="0" w:space="0" w:color="000000"/>
+              <w:top w:val="none" w:sz="0" w:space="0" w:color="000000"/>
+              <w:left w:val="none" w:sz="0" w:space="0" w:color="000000"/>
+              <w:right w:val="none" w:sz="0" w:space="0" w:color="000000"/>
+            </w:tcBorders>
+            <w:shd w:val="clear" w:color="auto" w:fill="FFFFFF"/>
+            <w:tcMar>
+              <w:top w:w="0" w:type="dxa"/>
+              <w:bottom w:w="0" w:type="dxa"/>
+              <w:left w:w="0" w:type="dxa"/>
+              <w:right w:w="0" w:type="dxa"/>
+            </w:tcMar>
+            <w:vAlign w:val="center"/>
+          </w:tcPr>
+          <w:p>
+            <w:pPr>
+              <w:pStyle w:val="Normal"/>
+              <w:jc w:val="center"/>
+              <w:pBdr>
+                <w:bottom w:val="none" w:sz="0" w:space="0" w:color="000000"/>
+                <w:top w:val="none" w:sz="0" w:space="0" w:color="000000"/>
+                <w:left w:val="none" w:sz="0" w:space="0" w:color="000000"/>
+                <w:right w:val="none" w:sz="0" w:space="0" w:color="000000"/>
+              </w:pBdr>
+              <w:spacing w:after="100" w:before="100" w:line="240"/>
+              <w:ind w:left="100" w:right="100" w:firstLine="0" w:firstLineChars="0"/>
+            </w:pPr>
+            <w:r>
+              <w:rPr>
+                <w:rFonts w:ascii="Helvetica" w:hAnsi="Helvetica" w:eastAsia="Helvetica" w:cs="Helvetica"/>
+                <w:i w:val="false"/>
+                <w:b w:val="false"/>
+                <w:u w:val="none"/>
+                <w:sz w:val="22"/>
+                <w:szCs w:val="22"/>
+                <w:color w:val="000000"/>
+              </w:rPr>
+              <w:t xml:space="preserve">5 (21.7%)</w:t>
+            </w:r>
+          </w:p>
+        </w:tc>
+        <w:tc>
+          <w:tcPr>
+            <w:tcBorders>
+              <w:bottom w:val="none" w:sz="0" w:space="0" w:color="000000"/>
+              <w:top w:val="none" w:sz="0" w:space="0" w:color="000000"/>
+              <w:left w:val="none" w:sz="0" w:space="0" w:color="000000"/>
+              <w:right w:val="none" w:sz="0" w:space="0" w:color="000000"/>
+            </w:tcBorders>
+            <w:shd w:val="clear" w:color="auto" w:fill="FFFFFF"/>
+            <w:tcMar>
+              <w:top w:w="0" w:type="dxa"/>
+              <w:bottom w:w="0" w:type="dxa"/>
+              <w:left w:w="0" w:type="dxa"/>
+              <w:right w:w="0" w:type="dxa"/>
+            </w:tcMar>
+            <w:vAlign w:val="center"/>
+          </w:tcPr>
+          <w:p>
+            <w:pPr>
+              <w:pStyle w:val="Normal"/>
+              <w:jc w:val="center"/>
+              <w:pBdr>
+                <w:bottom w:val="none" w:sz="0" w:space="0" w:color="000000"/>
+                <w:top w:val="none" w:sz="0" w:space="0" w:color="000000"/>
+                <w:left w:val="none" w:sz="0" w:space="0" w:color="000000"/>
+                <w:right w:val="none" w:sz="0" w:space="0" w:color="000000"/>
+              </w:pBdr>
+              <w:spacing w:after="100" w:before="100" w:line="240"/>
+              <w:ind w:left="100" w:right="100" w:firstLine="0" w:firstLineChars="0"/>
+            </w:pPr>
+            <w:r>
+              <w:rPr>
+                <w:rFonts w:ascii="Helvetica" w:hAnsi="Helvetica" w:eastAsia="Helvetica" w:cs="Helvetica"/>
+                <w:i w:val="false"/>
+                <w:b w:val="false"/>
+                <w:u w:val="none"/>
+                <w:sz w:val="22"/>
+                <w:szCs w:val="22"/>
+                <w:color w:val="000000"/>
+              </w:rPr>
+              <w:t xml:space="preserve">4 (22.2%)</w:t>
+            </w:r>
+          </w:p>
+        </w:tc>
+        <w:tc>
+          <w:tcPr>
+            <w:tcBorders>
+              <w:bottom w:val="none" w:sz="0" w:space="0" w:color="000000"/>
+              <w:top w:val="none" w:sz="0" w:space="0" w:color="000000"/>
+              <w:left w:val="none" w:sz="0" w:space="0" w:color="000000"/>
+              <w:right w:val="none" w:sz="0" w:space="0" w:color="000000"/>
+            </w:tcBorders>
+            <w:shd w:val="clear" w:color="auto" w:fill="FFFFFF"/>
+            <w:tcMar>
+              <w:top w:w="0" w:type="dxa"/>
+              <w:bottom w:w="0" w:type="dxa"/>
+              <w:left w:w="0" w:type="dxa"/>
+              <w:right w:w="0" w:type="dxa"/>
+            </w:tcMar>
+            <w:vAlign w:val="center"/>
+          </w:tcPr>
+          <w:p>
+            <w:pPr>
+              <w:pStyle w:val="Normal"/>
+              <w:jc w:val="center"/>
+              <w:pBdr>
+                <w:bottom w:val="none" w:sz="0" w:space="0" w:color="000000"/>
+                <w:top w:val="none" w:sz="0" w:space="0" w:color="000000"/>
+                <w:left w:val="none" w:sz="0" w:space="0" w:color="000000"/>
+                <w:right w:val="none" w:sz="0" w:space="0" w:color="000000"/>
+              </w:pBdr>
+              <w:spacing w:after="100" w:before="100" w:line="240"/>
+              <w:ind w:left="100" w:right="100" w:firstLine="0" w:firstLineChars="0"/>
+            </w:pPr>
+            <w:r>
+              <w:rPr>
+                <w:rFonts w:ascii="Helvetica" w:hAnsi="Helvetica" w:eastAsia="Helvetica" w:cs="Helvetica"/>
+                <w:i w:val="false"/>
+                <w:b w:val="false"/>
+                <w:u w:val="none"/>
+                <w:sz w:val="22"/>
+                <w:szCs w:val="22"/>
+                <w:color w:val="000000"/>
+              </w:rPr>
+              <w:t xml:space="preserve"/>
+            </w:r>
+          </w:p>
+        </w:tc>
+      </w:tr>
+      <w:tr>
+        <w:trPr>
+          <w:trHeight w:val="617" w:hRule="auto"/>
+        </w:trPr>
+        body35
+        <w:tc>
+          <w:tcPr>
+            <w:tcBorders>
+              <w:bottom w:val="none" w:sz="0" w:space="0" w:color="000000"/>
+              <w:top w:val="none" w:sz="0" w:space="0" w:color="000000"/>
+              <w:left w:val="none" w:sz="0" w:space="0" w:color="000000"/>
+              <w:right w:val="none" w:sz="0" w:space="0" w:color="000000"/>
+            </w:tcBorders>
+            <w:shd w:val="clear" w:color="auto" w:fill="FFFFFF"/>
+            <w:tcMar>
+              <w:top w:w="0" w:type="dxa"/>
+              <w:bottom w:w="0" w:type="dxa"/>
+              <w:left w:w="0" w:type="dxa"/>
+              <w:right w:w="0" w:type="dxa"/>
+            </w:tcMar>
+            <w:vAlign w:val="center"/>
+          </w:tcPr>
+          <w:p>
+            <w:pPr>
+              <w:pStyle w:val="Normal"/>
+              <w:jc w:val="left"/>
+              <w:pBdr>
+                <w:bottom w:val="none" w:sz="0" w:space="0" w:color="000000"/>
+                <w:top w:val="none" w:sz="0" w:space="0" w:color="000000"/>
+                <w:left w:val="none" w:sz="0" w:space="0" w:color="000000"/>
+                <w:right w:val="none" w:sz="0" w:space="0" w:color="000000"/>
+              </w:pBdr>
+              <w:spacing w:after="100" w:before="100" w:line="240"/>
+              <w:ind w:left="100" w:right="100" w:firstLine="0" w:firstLineChars="0"/>
+            </w:pPr>
+            <w:r>
+              <w:rPr>
+                <w:rFonts w:ascii="Helvetica" w:hAnsi="Helvetica" w:eastAsia="Helvetica" w:cs="Helvetica"/>
+                <w:i w:val="false"/>
+                <w:b w:val="true"/>
+                <w:u w:val="none"/>
+                <w:sz w:val="22"/>
+                <w:szCs w:val="22"/>
+                <w:color w:val="000000"/>
+              </w:rPr>
+              <w:t xml:space="preserve">Average Daily METs</w:t>
+            </w:r>
+          </w:p>
+        </w:tc>
+        <w:tc>
+          <w:tcPr>
+            <w:tcBorders>
+              <w:bottom w:val="none" w:sz="0" w:space="0" w:color="000000"/>
+              <w:top w:val="none" w:sz="0" w:space="0" w:color="000000"/>
+              <w:left w:val="none" w:sz="0" w:space="0" w:color="000000"/>
+              <w:right w:val="none" w:sz="0" w:space="0" w:color="000000"/>
+            </w:tcBorders>
+            <w:shd w:val="clear" w:color="auto" w:fill="FFFFFF"/>
+            <w:tcMar>
+              <w:top w:w="0" w:type="dxa"/>
+              <w:bottom w:w="0" w:type="dxa"/>
+              <w:left w:w="0" w:type="dxa"/>
+              <w:right w:w="0" w:type="dxa"/>
+            </w:tcMar>
+            <w:vAlign w:val="center"/>
+          </w:tcPr>
+          <w:p>
+            <w:pPr>
+              <w:pStyle w:val="Normal"/>
+              <w:jc w:val="center"/>
+              <w:pBdr>
+                <w:bottom w:val="none" w:sz="0" w:space="0" w:color="000000"/>
+                <w:top w:val="none" w:sz="0" w:space="0" w:color="000000"/>
+                <w:left w:val="none" w:sz="0" w:space="0" w:color="000000"/>
+                <w:right w:val="none" w:sz="0" w:space="0" w:color="000000"/>
+              </w:pBdr>
+              <w:spacing w:after="100" w:before="100" w:line="240"/>
+              <w:ind w:left="100" w:right="100" w:firstLine="0" w:firstLineChars="0"/>
+            </w:pPr>
+            <w:r>
+              <w:rPr>
+                <w:rFonts w:ascii="Helvetica" w:hAnsi="Helvetica" w:eastAsia="Helvetica" w:cs="Helvetica"/>
+                <w:i w:val="false"/>
+                <w:b w:val="false"/>
+                <w:u w:val="none"/>
+                <w:sz w:val="22"/>
+                <w:szCs w:val="22"/>
+                <w:color w:val="000000"/>
+              </w:rPr>
+              <w:t xml:space="preserve"/>
+            </w:r>
+          </w:p>
+        </w:tc>
+        <w:tc>
+          <w:tcPr>
+            <w:tcBorders>
+              <w:bottom w:val="none" w:sz="0" w:space="0" w:color="000000"/>
+              <w:top w:val="none" w:sz="0" w:space="0" w:color="000000"/>
+              <w:left w:val="none" w:sz="0" w:space="0" w:color="000000"/>
+              <w:right w:val="none" w:sz="0" w:space="0" w:color="000000"/>
+            </w:tcBorders>
+            <w:shd w:val="clear" w:color="auto" w:fill="FFFFFF"/>
+            <w:tcMar>
+              <w:top w:w="0" w:type="dxa"/>
+              <w:bottom w:w="0" w:type="dxa"/>
+              <w:left w:w="0" w:type="dxa"/>
+              <w:right w:w="0" w:type="dxa"/>
+            </w:tcMar>
+            <w:vAlign w:val="center"/>
+          </w:tcPr>
+          <w:p>
+            <w:pPr>
+              <w:pStyle w:val="Normal"/>
+              <w:jc w:val="center"/>
+              <w:pBdr>
+                <w:bottom w:val="none" w:sz="0" w:space="0" w:color="000000"/>
+                <w:top w:val="none" w:sz="0" w:space="0" w:color="000000"/>
+                <w:left w:val="none" w:sz="0" w:space="0" w:color="000000"/>
+                <w:right w:val="none" w:sz="0" w:space="0" w:color="000000"/>
+              </w:pBdr>
+              <w:spacing w:after="100" w:before="100" w:line="240"/>
+              <w:ind w:left="100" w:right="100" w:firstLine="0" w:firstLineChars="0"/>
+            </w:pPr>
+            <w:r>
+              <w:rPr>
+                <w:rFonts w:ascii="Helvetica" w:hAnsi="Helvetica" w:eastAsia="Helvetica" w:cs="Helvetica"/>
+                <w:i w:val="false"/>
+                <w:b w:val="false"/>
+                <w:u w:val="none"/>
+                <w:sz w:val="22"/>
+                <w:szCs w:val="22"/>
+                <w:color w:val="000000"/>
+              </w:rPr>
+              <w:t xml:space="preserve"/>
+            </w:r>
+          </w:p>
+        </w:tc>
+        <w:tc>
+          <w:tcPr>
+            <w:tcBorders>
+              <w:bottom w:val="none" w:sz="0" w:space="0" w:color="000000"/>
+              <w:top w:val="none" w:sz="0" w:space="0" w:color="000000"/>
+              <w:left w:val="none" w:sz="0" w:space="0" w:color="000000"/>
+              <w:right w:val="none" w:sz="0" w:space="0" w:color="000000"/>
+            </w:tcBorders>
+            <w:shd w:val="clear" w:color="auto" w:fill="FFFFFF"/>
+            <w:tcMar>
+              <w:top w:w="0" w:type="dxa"/>
+              <w:bottom w:w="0" w:type="dxa"/>
+              <w:left w:w="0" w:type="dxa"/>
+              <w:right w:w="0" w:type="dxa"/>
+            </w:tcMar>
+            <w:vAlign w:val="center"/>
+          </w:tcPr>
+          <w:p>
+            <w:pPr>
+              <w:pStyle w:val="Normal"/>
+              <w:jc w:val="center"/>
+              <w:pBdr>
+                <w:bottom w:val="none" w:sz="0" w:space="0" w:color="000000"/>
+                <w:top w:val="none" w:sz="0" w:space="0" w:color="000000"/>
+                <w:left w:val="none" w:sz="0" w:space="0" w:color="000000"/>
+                <w:right w:val="none" w:sz="0" w:space="0" w:color="000000"/>
+              </w:pBdr>
+              <w:spacing w:after="100" w:before="100" w:line="240"/>
+              <w:ind w:left="100" w:right="100" w:firstLine="0" w:firstLineChars="0"/>
+            </w:pPr>
+            <w:r>
+              <w:rPr>
+                <w:rFonts w:ascii="Helvetica" w:hAnsi="Helvetica" w:eastAsia="Helvetica" w:cs="Helvetica"/>
+                <w:i w:val="false"/>
+                <w:b w:val="false"/>
+                <w:u w:val="none"/>
+                <w:sz w:val="22"/>
+                <w:szCs w:val="22"/>
+                <w:color w:val="000000"/>
+              </w:rPr>
+              <w:t xml:space="preserve"/>
+            </w:r>
+          </w:p>
+        </w:tc>
+      </w:tr>
+      <w:tr>
+        <w:trPr>
+          <w:trHeight w:val="616" w:hRule="auto"/>
+        </w:trPr>
+        body36
+        <w:tc>
+          <w:tcPr>
+            <w:tcBorders>
+              <w:bottom w:val="none" w:sz="0" w:space="0" w:color="000000"/>
+              <w:top w:val="none" w:sz="0" w:space="0" w:color="000000"/>
+              <w:left w:val="none" w:sz="0" w:space="0" w:color="000000"/>
+              <w:right w:val="none" w:sz="0" w:space="0" w:color="000000"/>
+            </w:tcBorders>
+            <w:shd w:val="clear" w:color="auto" w:fill="FFFFFF"/>
+            <w:tcMar>
+              <w:top w:w="0" w:type="dxa"/>
+              <w:bottom w:w="0" w:type="dxa"/>
+              <w:left w:w="0" w:type="dxa"/>
+              <w:right w:w="0" w:type="dxa"/>
+            </w:tcMar>
+            <w:vAlign w:val="center"/>
+          </w:tcPr>
+          <w:p>
+            <w:pPr>
+              <w:pStyle w:val="Normal"/>
+              <w:jc w:val="left"/>
+              <w:pBdr>
+                <w:bottom w:val="none" w:sz="0" w:space="0" w:color="000000"/>
+                <w:top w:val="none" w:sz="0" w:space="0" w:color="000000"/>
+                <w:left w:val="none" w:sz="0" w:space="0" w:color="000000"/>
+                <w:right w:val="none" w:sz="0" w:space="0" w:color="000000"/>
+              </w:pBdr>
+              <w:spacing w:after="100" w:before="100" w:line="240"/>
+              <w:ind w:left="100" w:right="100" w:firstLine="0" w:firstLineChars="0"/>
+            </w:pPr>
+            <w:r>
+              <w:rPr>
+                <w:rFonts w:ascii="Helvetica" w:hAnsi="Helvetica" w:eastAsia="Helvetica" w:cs="Helvetica"/>
+                <w:i w:val="false"/>
+                <w:b w:val="false"/>
+                <w:u w:val="none"/>
+                <w:sz w:val="22"/>
+                <w:szCs w:val="22"/>
+                <w:color w:val="000000"/>
+              </w:rPr>
+              <w:t xml:space="preserve">  Mean ± SD</w:t>
+            </w:r>
+          </w:p>
+        </w:tc>
+        <w:tc>
+          <w:tcPr>
+            <w:tcBorders>
+              <w:bottom w:val="none" w:sz="0" w:space="0" w:color="000000"/>
+              <w:top w:val="none" w:sz="0" w:space="0" w:color="000000"/>
+              <w:left w:val="none" w:sz="0" w:space="0" w:color="000000"/>
+              <w:right w:val="none" w:sz="0" w:space="0" w:color="000000"/>
+            </w:tcBorders>
+            <w:shd w:val="clear" w:color="auto" w:fill="FFFFFF"/>
+            <w:tcMar>
+              <w:top w:w="0" w:type="dxa"/>
+              <w:bottom w:w="0" w:type="dxa"/>
+              <w:left w:w="0" w:type="dxa"/>
+              <w:right w:w="0" w:type="dxa"/>
+            </w:tcMar>
+            <w:vAlign w:val="center"/>
+          </w:tcPr>
+          <w:p>
+            <w:pPr>
+              <w:pStyle w:val="Normal"/>
+              <w:jc w:val="center"/>
+              <w:pBdr>
+                <w:bottom w:val="none" w:sz="0" w:space="0" w:color="000000"/>
+                <w:top w:val="none" w:sz="0" w:space="0" w:color="000000"/>
+                <w:left w:val="none" w:sz="0" w:space="0" w:color="000000"/>
+                <w:right w:val="none" w:sz="0" w:space="0" w:color="000000"/>
+              </w:pBdr>
+              <w:spacing w:after="100" w:before="100" w:line="240"/>
+              <w:ind w:left="100" w:right="100" w:firstLine="0" w:firstLineChars="0"/>
+            </w:pPr>
+            <w:r>
+              <w:rPr>
+                <w:rFonts w:ascii="Helvetica" w:hAnsi="Helvetica" w:eastAsia="Helvetica" w:cs="Helvetica"/>
+                <w:i w:val="false"/>
+                <w:b w:val="false"/>
+                <w:u w:val="none"/>
+                <w:sz w:val="22"/>
+                <w:szCs w:val="22"/>
+                <w:color w:val="000000"/>
+              </w:rPr>
+              <w:t xml:space="preserve">1.34 ± 0.0578</w:t>
+            </w:r>
+          </w:p>
+        </w:tc>
+        <w:tc>
+          <w:tcPr>
+            <w:tcBorders>
+              <w:bottom w:val="none" w:sz="0" w:space="0" w:color="000000"/>
+              <w:top w:val="none" w:sz="0" w:space="0" w:color="000000"/>
+              <w:left w:val="none" w:sz="0" w:space="0" w:color="000000"/>
+              <w:right w:val="none" w:sz="0" w:space="0" w:color="000000"/>
+            </w:tcBorders>
+            <w:shd w:val="clear" w:color="auto" w:fill="FFFFFF"/>
+            <w:tcMar>
+              <w:top w:w="0" w:type="dxa"/>
+              <w:bottom w:w="0" w:type="dxa"/>
+              <w:left w:w="0" w:type="dxa"/>
+              <w:right w:w="0" w:type="dxa"/>
+            </w:tcMar>
+            <w:vAlign w:val="center"/>
+          </w:tcPr>
+          <w:p>
+            <w:pPr>
+              <w:pStyle w:val="Normal"/>
+              <w:jc w:val="center"/>
+              <w:pBdr>
+                <w:bottom w:val="none" w:sz="0" w:space="0" w:color="000000"/>
+                <w:top w:val="none" w:sz="0" w:space="0" w:color="000000"/>
+                <w:left w:val="none" w:sz="0" w:space="0" w:color="000000"/>
+                <w:right w:val="none" w:sz="0" w:space="0" w:color="000000"/>
+              </w:pBdr>
+              <w:spacing w:after="100" w:before="100" w:line="240"/>
+              <w:ind w:left="100" w:right="100" w:firstLine="0" w:firstLineChars="0"/>
+            </w:pPr>
+            <w:r>
+              <w:rPr>
+                <w:rFonts w:ascii="Helvetica" w:hAnsi="Helvetica" w:eastAsia="Helvetica" w:cs="Helvetica"/>
+                <w:i w:val="false"/>
+                <w:b w:val="false"/>
+                <w:u w:val="none"/>
+                <w:sz w:val="22"/>
+                <w:szCs w:val="22"/>
+                <w:color w:val="000000"/>
+              </w:rPr>
+              <w:t xml:space="preserve">1.39 ± 0.137</w:t>
+            </w:r>
+          </w:p>
+        </w:tc>
+        <w:tc>
+          <w:tcPr>
+            <w:tcBorders>
+              <w:bottom w:val="none" w:sz="0" w:space="0" w:color="000000"/>
+              <w:top w:val="none" w:sz="0" w:space="0" w:color="000000"/>
+              <w:left w:val="none" w:sz="0" w:space="0" w:color="000000"/>
+              <w:right w:val="none" w:sz="0" w:space="0" w:color="000000"/>
+            </w:tcBorders>
+            <w:shd w:val="clear" w:color="auto" w:fill="FFFFFF"/>
+            <w:tcMar>
+              <w:top w:w="0" w:type="dxa"/>
+              <w:bottom w:w="0" w:type="dxa"/>
+              <w:left w:w="0" w:type="dxa"/>
+              <w:right w:w="0" w:type="dxa"/>
+            </w:tcMar>
+            <w:vAlign w:val="center"/>
+          </w:tcPr>
+          <w:p>
+            <w:pPr>
+              <w:pStyle w:val="Normal"/>
+              <w:jc w:val="center"/>
+              <w:pBdr>
+                <w:bottom w:val="none" w:sz="0" w:space="0" w:color="000000"/>
+                <w:top w:val="none" w:sz="0" w:space="0" w:color="000000"/>
+                <w:left w:val="none" w:sz="0" w:space="0" w:color="000000"/>
+                <w:right w:val="none" w:sz="0" w:space="0" w:color="000000"/>
+              </w:pBdr>
+              <w:spacing w:after="100" w:before="100" w:line="240"/>
+              <w:ind w:left="100" w:right="100" w:firstLine="0" w:firstLineChars="0"/>
+            </w:pPr>
+            <w:r>
+              <w:rPr>
+                <w:rFonts w:ascii="Helvetica" w:hAnsi="Helvetica" w:eastAsia="Helvetica" w:cs="Helvetica"/>
+                <w:i w:val="false"/>
+                <w:b w:val="false"/>
+                <w:u w:val="none"/>
+                <w:sz w:val="22"/>
+                <w:szCs w:val="22"/>
+                <w:color w:val="000000"/>
+              </w:rPr>
+              <w:t xml:space="preserve">&amp;lt;0.001 (Wilcoxon)</w:t>
+            </w:r>
+          </w:p>
+        </w:tc>
+      </w:tr>
+      <w:tr>
+        <w:trPr>
+          <w:trHeight w:val="616" w:hRule="auto"/>
+        </w:trPr>
+        body37
+        <w:tc>
+          <w:tcPr>
+            <w:tcBorders>
+              <w:bottom w:val="none" w:sz="0" w:space="0" w:color="000000"/>
+              <w:top w:val="none" w:sz="0" w:space="0" w:color="000000"/>
+              <w:left w:val="none" w:sz="0" w:space="0" w:color="000000"/>
+              <w:right w:val="none" w:sz="0" w:space="0" w:color="000000"/>
+            </w:tcBorders>
+            <w:shd w:val="clear" w:color="auto" w:fill="FFFFFF"/>
+            <w:tcMar>
+              <w:top w:w="0" w:type="dxa"/>
+              <w:bottom w:w="0" w:type="dxa"/>
+              <w:left w:w="0" w:type="dxa"/>
+              <w:right w:w="0" w:type="dxa"/>
+            </w:tcMar>
+            <w:vAlign w:val="center"/>
+          </w:tcPr>
+          <w:p>
+            <w:pPr>
+              <w:pStyle w:val="Normal"/>
+              <w:jc w:val="left"/>
+              <w:pBdr>
+                <w:bottom w:val="none" w:sz="0" w:space="0" w:color="000000"/>
+                <w:top w:val="none" w:sz="0" w:space="0" w:color="000000"/>
+                <w:left w:val="none" w:sz="0" w:space="0" w:color="000000"/>
+                <w:right w:val="none" w:sz="0" w:space="0" w:color="000000"/>
+              </w:pBdr>
+              <w:spacing w:after="100" w:before="100" w:line="240"/>
+              <w:ind w:left="100" w:right="100" w:firstLine="0" w:firstLineChars="0"/>
+            </w:pPr>
+            <w:r>
+              <w:rPr>
+                <w:rFonts w:ascii="Helvetica" w:hAnsi="Helvetica" w:eastAsia="Helvetica" w:cs="Helvetica"/>
+                <w:i w:val="false"/>
+                <w:b w:val="false"/>
+                <w:u w:val="none"/>
+                <w:sz w:val="22"/>
+                <w:szCs w:val="22"/>
+                <w:color w:val="000000"/>
+              </w:rPr>
+              <w:t xml:space="preserve">  Median [IQR]</w:t>
+            </w:r>
+          </w:p>
+        </w:tc>
+        <w:tc>
+          <w:tcPr>
+            <w:tcBorders>
+              <w:bottom w:val="none" w:sz="0" w:space="0" w:color="000000"/>
+              <w:top w:val="none" w:sz="0" w:space="0" w:color="000000"/>
+              <w:left w:val="none" w:sz="0" w:space="0" w:color="000000"/>
+              <w:right w:val="none" w:sz="0" w:space="0" w:color="000000"/>
+            </w:tcBorders>
+            <w:shd w:val="clear" w:color="auto" w:fill="FFFFFF"/>
+            <w:tcMar>
+              <w:top w:w="0" w:type="dxa"/>
+              <w:bottom w:w="0" w:type="dxa"/>
+              <w:left w:w="0" w:type="dxa"/>
+              <w:right w:w="0" w:type="dxa"/>
+            </w:tcMar>
+            <w:vAlign w:val="center"/>
+          </w:tcPr>
+          <w:p>
+            <w:pPr>
+              <w:pStyle w:val="Normal"/>
+              <w:jc w:val="center"/>
+              <w:pBdr>
+                <w:bottom w:val="none" w:sz="0" w:space="0" w:color="000000"/>
+                <w:top w:val="none" w:sz="0" w:space="0" w:color="000000"/>
+                <w:left w:val="none" w:sz="0" w:space="0" w:color="000000"/>
+                <w:right w:val="none" w:sz="0" w:space="0" w:color="000000"/>
+              </w:pBdr>
+              <w:spacing w:after="100" w:before="100" w:line="240"/>
+              <w:ind w:left="100" w:right="100" w:firstLine="0" w:firstLineChars="0"/>
+            </w:pPr>
+            <w:r>
+              <w:rPr>
+                <w:rFonts w:ascii="Helvetica" w:hAnsi="Helvetica" w:eastAsia="Helvetica" w:cs="Helvetica"/>
+                <w:i w:val="false"/>
+                <w:b w:val="false"/>
+                <w:u w:val="none"/>
+                <w:sz w:val="22"/>
+                <w:szCs w:val="22"/>
+                <w:color w:val="000000"/>
+              </w:rPr>
+              <w:t xml:space="preserve">1.32 [1.30, 1.37]</w:t>
+            </w:r>
+          </w:p>
+        </w:tc>
+        <w:tc>
+          <w:tcPr>
+            <w:tcBorders>
+              <w:bottom w:val="none" w:sz="0" w:space="0" w:color="000000"/>
+              <w:top w:val="none" w:sz="0" w:space="0" w:color="000000"/>
+              <w:left w:val="none" w:sz="0" w:space="0" w:color="000000"/>
+              <w:right w:val="none" w:sz="0" w:space="0" w:color="000000"/>
+            </w:tcBorders>
+            <w:shd w:val="clear" w:color="auto" w:fill="FFFFFF"/>
+            <w:tcMar>
+              <w:top w:w="0" w:type="dxa"/>
+              <w:bottom w:w="0" w:type="dxa"/>
+              <w:left w:w="0" w:type="dxa"/>
+              <w:right w:w="0" w:type="dxa"/>
+            </w:tcMar>
+            <w:vAlign w:val="center"/>
+          </w:tcPr>
+          <w:p>
+            <w:pPr>
+              <w:pStyle w:val="Normal"/>
+              <w:jc w:val="center"/>
+              <w:pBdr>
+                <w:bottom w:val="none" w:sz="0" w:space="0" w:color="000000"/>
+                <w:top w:val="none" w:sz="0" w:space="0" w:color="000000"/>
+                <w:left w:val="none" w:sz="0" w:space="0" w:color="000000"/>
+                <w:right w:val="none" w:sz="0" w:space="0" w:color="000000"/>
+              </w:pBdr>
+              <w:spacing w:after="100" w:before="100" w:line="240"/>
+              <w:ind w:left="100" w:right="100" w:firstLine="0" w:firstLineChars="0"/>
+            </w:pPr>
+            <w:r>
+              <w:rPr>
+                <w:rFonts w:ascii="Helvetica" w:hAnsi="Helvetica" w:eastAsia="Helvetica" w:cs="Helvetica"/>
+                <w:i w:val="false"/>
+                <w:b w:val="false"/>
+                <w:u w:val="none"/>
+                <w:sz w:val="22"/>
+                <w:szCs w:val="22"/>
+                <w:color w:val="000000"/>
+              </w:rPr>
+              <w:t xml:space="preserve">1.41 [1.37, 1.44]</w:t>
+            </w:r>
+          </w:p>
+        </w:tc>
+        <w:tc>
+          <w:tcPr>
+            <w:tcBorders>
+              <w:bottom w:val="none" w:sz="0" w:space="0" w:color="000000"/>
+              <w:top w:val="none" w:sz="0" w:space="0" w:color="000000"/>
+              <w:left w:val="none" w:sz="0" w:space="0" w:color="000000"/>
+              <w:right w:val="none" w:sz="0" w:space="0" w:color="000000"/>
+            </w:tcBorders>
+            <w:shd w:val="clear" w:color="auto" w:fill="FFFFFF"/>
+            <w:tcMar>
+              <w:top w:w="0" w:type="dxa"/>
+              <w:bottom w:w="0" w:type="dxa"/>
+              <w:left w:w="0" w:type="dxa"/>
+              <w:right w:w="0" w:type="dxa"/>
+            </w:tcMar>
+            <w:vAlign w:val="center"/>
+          </w:tcPr>
+          <w:p>
+            <w:pPr>
+              <w:pStyle w:val="Normal"/>
+              <w:jc w:val="center"/>
+              <w:pBdr>
+                <w:bottom w:val="none" w:sz="0" w:space="0" w:color="000000"/>
+                <w:top w:val="none" w:sz="0" w:space="0" w:color="000000"/>
+                <w:left w:val="none" w:sz="0" w:space="0" w:color="000000"/>
+                <w:right w:val="none" w:sz="0" w:space="0" w:color="000000"/>
+              </w:pBdr>
+              <w:spacing w:after="100" w:before="100" w:line="240"/>
+              <w:ind w:left="100" w:right="100" w:firstLine="0" w:firstLineChars="0"/>
+            </w:pPr>
+            <w:r>
+              <w:rPr>
+                <w:rFonts w:ascii="Helvetica" w:hAnsi="Helvetica" w:eastAsia="Helvetica" w:cs="Helvetica"/>
+                <w:i w:val="false"/>
+                <w:b w:val="false"/>
+                <w:u w:val="none"/>
+                <w:sz w:val="22"/>
+                <w:szCs w:val="22"/>
+                <w:color w:val="000000"/>
+              </w:rPr>
+              <w:t xml:space="preserve"/>
+            </w:r>
+          </w:p>
+        </w:tc>
+      </w:tr>
+      <w:tr>
+        <w:trPr>
+          <w:trHeight w:val="619" w:hRule="auto"/>
+        </w:trPr>
+        body38
+        <w:tc>
+          <w:tcPr>
+            <w:tcBorders>
+              <w:bottom w:val="none" w:sz="0" w:space="0" w:color="000000"/>
+              <w:top w:val="none" w:sz="0" w:space="0" w:color="000000"/>
+              <w:left w:val="none" w:sz="0" w:space="0" w:color="000000"/>
+              <w:right w:val="none" w:sz="0" w:space="0" w:color="000000"/>
+            </w:tcBorders>
+            <w:shd w:val="clear" w:color="auto" w:fill="FFFFFF"/>
+            <w:tcMar>
+              <w:top w:w="0" w:type="dxa"/>
+              <w:bottom w:w="0" w:type="dxa"/>
+              <w:left w:w="0" w:type="dxa"/>
+              <w:right w:w="0" w:type="dxa"/>
+            </w:tcMar>
+            <w:vAlign w:val="center"/>
+          </w:tcPr>
+          <w:p>
+            <w:pPr>
+              <w:pStyle w:val="Normal"/>
+              <w:jc w:val="left"/>
+              <w:pBdr>
+                <w:bottom w:val="none" w:sz="0" w:space="0" w:color="000000"/>
+                <w:top w:val="none" w:sz="0" w:space="0" w:color="000000"/>
+                <w:left w:val="none" w:sz="0" w:space="0" w:color="000000"/>
+                <w:right w:val="none" w:sz="0" w:space="0" w:color="000000"/>
+              </w:pBdr>
+              <w:spacing w:after="100" w:before="100" w:line="240"/>
+              <w:ind w:left="100" w:right="100" w:firstLine="0" w:firstLineChars="0"/>
+            </w:pPr>
+            <w:r>
+              <w:rPr>
+                <w:rFonts w:ascii="Helvetica" w:hAnsi="Helvetica" w:eastAsia="Helvetica" w:cs="Helvetica"/>
+                <w:i w:val="false"/>
+                <w:b w:val="true"/>
+                <w:u w:val="none"/>
+                <w:sz w:val="22"/>
+                <w:szCs w:val="22"/>
+                <w:color w:val="000000"/>
+              </w:rPr>
+              <w:t xml:space="preserve">Average Percent of Time in MVPA</w:t>
+            </w:r>
+          </w:p>
+        </w:tc>
+        <w:tc>
+          <w:tcPr>
+            <w:tcBorders>
+              <w:bottom w:val="none" w:sz="0" w:space="0" w:color="000000"/>
+              <w:top w:val="none" w:sz="0" w:space="0" w:color="000000"/>
+              <w:left w:val="none" w:sz="0" w:space="0" w:color="000000"/>
+              <w:right w:val="none" w:sz="0" w:space="0" w:color="000000"/>
+            </w:tcBorders>
+            <w:shd w:val="clear" w:color="auto" w:fill="FFFFFF"/>
+            <w:tcMar>
+              <w:top w:w="0" w:type="dxa"/>
+              <w:bottom w:w="0" w:type="dxa"/>
+              <w:left w:w="0" w:type="dxa"/>
+              <w:right w:w="0" w:type="dxa"/>
+            </w:tcMar>
+            <w:vAlign w:val="center"/>
+          </w:tcPr>
+          <w:p>
+            <w:pPr>
+              <w:pStyle w:val="Normal"/>
+              <w:jc w:val="center"/>
+              <w:pBdr>
+                <w:bottom w:val="none" w:sz="0" w:space="0" w:color="000000"/>
+                <w:top w:val="none" w:sz="0" w:space="0" w:color="000000"/>
+                <w:left w:val="none" w:sz="0" w:space="0" w:color="000000"/>
+                <w:right w:val="none" w:sz="0" w:space="0" w:color="000000"/>
+              </w:pBdr>
+              <w:spacing w:after="100" w:before="100" w:line="240"/>
+              <w:ind w:left="100" w:right="100" w:firstLine="0" w:firstLineChars="0"/>
+            </w:pPr>
+            <w:r>
+              <w:rPr>
+                <w:rFonts w:ascii="Helvetica" w:hAnsi="Helvetica" w:eastAsia="Helvetica" w:cs="Helvetica"/>
+                <w:i w:val="false"/>
+                <w:b w:val="false"/>
+                <w:u w:val="none"/>
+                <w:sz w:val="22"/>
+                <w:szCs w:val="22"/>
+                <w:color w:val="000000"/>
+              </w:rPr>
+              <w:t xml:space="preserve"/>
+            </w:r>
+          </w:p>
+        </w:tc>
+        <w:tc>
+          <w:tcPr>
+            <w:tcBorders>
+              <w:bottom w:val="none" w:sz="0" w:space="0" w:color="000000"/>
+              <w:top w:val="none" w:sz="0" w:space="0" w:color="000000"/>
+              <w:left w:val="none" w:sz="0" w:space="0" w:color="000000"/>
+              <w:right w:val="none" w:sz="0" w:space="0" w:color="000000"/>
+            </w:tcBorders>
+            <w:shd w:val="clear" w:color="auto" w:fill="FFFFFF"/>
+            <w:tcMar>
+              <w:top w:w="0" w:type="dxa"/>
+              <w:bottom w:w="0" w:type="dxa"/>
+              <w:left w:w="0" w:type="dxa"/>
+              <w:right w:w="0" w:type="dxa"/>
+            </w:tcMar>
+            <w:vAlign w:val="center"/>
+          </w:tcPr>
+          <w:p>
+            <w:pPr>
+              <w:pStyle w:val="Normal"/>
+              <w:jc w:val="center"/>
+              <w:pBdr>
+                <w:bottom w:val="none" w:sz="0" w:space="0" w:color="000000"/>
+                <w:top w:val="none" w:sz="0" w:space="0" w:color="000000"/>
+                <w:left w:val="none" w:sz="0" w:space="0" w:color="000000"/>
+                <w:right w:val="none" w:sz="0" w:space="0" w:color="000000"/>
+              </w:pBdr>
+              <w:spacing w:after="100" w:before="100" w:line="240"/>
+              <w:ind w:left="100" w:right="100" w:firstLine="0" w:firstLineChars="0"/>
+            </w:pPr>
+            <w:r>
+              <w:rPr>
+                <w:rFonts w:ascii="Helvetica" w:hAnsi="Helvetica" w:eastAsia="Helvetica" w:cs="Helvetica"/>
+                <w:i w:val="false"/>
+                <w:b w:val="false"/>
+                <w:u w:val="none"/>
+                <w:sz w:val="22"/>
+                <w:szCs w:val="22"/>
+                <w:color w:val="000000"/>
+              </w:rPr>
+              <w:t xml:space="preserve"/>
+            </w:r>
+          </w:p>
+        </w:tc>
+        <w:tc>
+          <w:tcPr>
+            <w:tcBorders>
+              <w:bottom w:val="none" w:sz="0" w:space="0" w:color="000000"/>
+              <w:top w:val="none" w:sz="0" w:space="0" w:color="000000"/>
+              <w:left w:val="none" w:sz="0" w:space="0" w:color="000000"/>
+              <w:right w:val="none" w:sz="0" w:space="0" w:color="000000"/>
+            </w:tcBorders>
+            <w:shd w:val="clear" w:color="auto" w:fill="FFFFFF"/>
+            <w:tcMar>
+              <w:top w:w="0" w:type="dxa"/>
+              <w:bottom w:w="0" w:type="dxa"/>
+              <w:left w:w="0" w:type="dxa"/>
+              <w:right w:w="0" w:type="dxa"/>
+            </w:tcMar>
+            <w:vAlign w:val="center"/>
+          </w:tcPr>
+          <w:p>
+            <w:pPr>
+              <w:pStyle w:val="Normal"/>
+              <w:jc w:val="center"/>
+              <w:pBdr>
+                <w:bottom w:val="none" w:sz="0" w:space="0" w:color="000000"/>
+                <w:top w:val="none" w:sz="0" w:space="0" w:color="000000"/>
+                <w:left w:val="none" w:sz="0" w:space="0" w:color="000000"/>
+                <w:right w:val="none" w:sz="0" w:space="0" w:color="000000"/>
+              </w:pBdr>
+              <w:spacing w:after="100" w:before="100" w:line="240"/>
+              <w:ind w:left="100" w:right="100" w:firstLine="0" w:firstLineChars="0"/>
+            </w:pPr>
+            <w:r>
+              <w:rPr>
+                <w:rFonts w:ascii="Helvetica" w:hAnsi="Helvetica" w:eastAsia="Helvetica" w:cs="Helvetica"/>
+                <w:i w:val="false"/>
+                <w:b w:val="false"/>
+                <w:u w:val="none"/>
+                <w:sz w:val="22"/>
+                <w:szCs w:val="22"/>
+                <w:color w:val="000000"/>
+              </w:rPr>
+              <w:t xml:space="preserve"/>
+            </w:r>
+          </w:p>
+        </w:tc>
+      </w:tr>
+      <w:tr>
+        <w:trPr>
+          <w:trHeight w:val="616" w:hRule="auto"/>
+        </w:trPr>
+        body39
+        <w:tc>
+          <w:tcPr>
+            <w:tcBorders>
+              <w:bottom w:val="none" w:sz="0" w:space="0" w:color="000000"/>
+              <w:top w:val="none" w:sz="0" w:space="0" w:color="000000"/>
+              <w:left w:val="none" w:sz="0" w:space="0" w:color="000000"/>
+              <w:right w:val="none" w:sz="0" w:space="0" w:color="000000"/>
+            </w:tcBorders>
+            <w:shd w:val="clear" w:color="auto" w:fill="FFFFFF"/>
+            <w:tcMar>
+              <w:top w:w="0" w:type="dxa"/>
+              <w:bottom w:w="0" w:type="dxa"/>
+              <w:left w:w="0" w:type="dxa"/>
+              <w:right w:w="0" w:type="dxa"/>
+            </w:tcMar>
+            <w:vAlign w:val="center"/>
+          </w:tcPr>
+          <w:p>
+            <w:pPr>
+              <w:pStyle w:val="Normal"/>
+              <w:jc w:val="left"/>
+              <w:pBdr>
+                <w:bottom w:val="none" w:sz="0" w:space="0" w:color="000000"/>
+                <w:top w:val="none" w:sz="0" w:space="0" w:color="000000"/>
+                <w:left w:val="none" w:sz="0" w:space="0" w:color="000000"/>
+                <w:right w:val="none" w:sz="0" w:space="0" w:color="000000"/>
+              </w:pBdr>
+              <w:spacing w:after="100" w:before="100" w:line="240"/>
+              <w:ind w:left="100" w:right="100" w:firstLine="0" w:firstLineChars="0"/>
+            </w:pPr>
+            <w:r>
+              <w:rPr>
+                <w:rFonts w:ascii="Helvetica" w:hAnsi="Helvetica" w:eastAsia="Helvetica" w:cs="Helvetica"/>
+                <w:i w:val="false"/>
+                <w:b w:val="false"/>
+                <w:u w:val="none"/>
+                <w:sz w:val="22"/>
+                <w:szCs w:val="22"/>
+                <w:color w:val="000000"/>
+              </w:rPr>
+              <w:t xml:space="preserve">  Mean ± SD</w:t>
+            </w:r>
+          </w:p>
+        </w:tc>
+        <w:tc>
+          <w:tcPr>
+            <w:tcBorders>
+              <w:bottom w:val="none" w:sz="0" w:space="0" w:color="000000"/>
+              <w:top w:val="none" w:sz="0" w:space="0" w:color="000000"/>
+              <w:left w:val="none" w:sz="0" w:space="0" w:color="000000"/>
+              <w:right w:val="none" w:sz="0" w:space="0" w:color="000000"/>
+            </w:tcBorders>
+            <w:shd w:val="clear" w:color="auto" w:fill="FFFFFF"/>
+            <w:tcMar>
+              <w:top w:w="0" w:type="dxa"/>
+              <w:bottom w:w="0" w:type="dxa"/>
+              <w:left w:w="0" w:type="dxa"/>
+              <w:right w:w="0" w:type="dxa"/>
+            </w:tcMar>
+            <w:vAlign w:val="center"/>
+          </w:tcPr>
+          <w:p>
+            <w:pPr>
+              <w:pStyle w:val="Normal"/>
+              <w:jc w:val="center"/>
+              <w:pBdr>
+                <w:bottom w:val="none" w:sz="0" w:space="0" w:color="000000"/>
+                <w:top w:val="none" w:sz="0" w:space="0" w:color="000000"/>
+                <w:left w:val="none" w:sz="0" w:space="0" w:color="000000"/>
+                <w:right w:val="none" w:sz="0" w:space="0" w:color="000000"/>
+              </w:pBdr>
+              <w:spacing w:after="100" w:before="100" w:line="240"/>
+              <w:ind w:left="100" w:right="100" w:firstLine="0" w:firstLineChars="0"/>
+            </w:pPr>
+            <w:r>
+              <w:rPr>
+                <w:rFonts w:ascii="Helvetica" w:hAnsi="Helvetica" w:eastAsia="Helvetica" w:cs="Helvetica"/>
+                <w:i w:val="false"/>
+                <w:b w:val="false"/>
+                <w:u w:val="none"/>
+                <w:sz w:val="22"/>
+                <w:szCs w:val="22"/>
+                <w:color w:val="000000"/>
+              </w:rPr>
+              <w:t xml:space="preserve">1.15 ± 1.09</w:t>
+            </w:r>
+          </w:p>
+        </w:tc>
+        <w:tc>
+          <w:tcPr>
+            <w:tcBorders>
+              <w:bottom w:val="none" w:sz="0" w:space="0" w:color="000000"/>
+              <w:top w:val="none" w:sz="0" w:space="0" w:color="000000"/>
+              <w:left w:val="none" w:sz="0" w:space="0" w:color="000000"/>
+              <w:right w:val="none" w:sz="0" w:space="0" w:color="000000"/>
+            </w:tcBorders>
+            <w:shd w:val="clear" w:color="auto" w:fill="FFFFFF"/>
+            <w:tcMar>
+              <w:top w:w="0" w:type="dxa"/>
+              <w:bottom w:w="0" w:type="dxa"/>
+              <w:left w:w="0" w:type="dxa"/>
+              <w:right w:w="0" w:type="dxa"/>
+            </w:tcMar>
+            <w:vAlign w:val="center"/>
+          </w:tcPr>
+          <w:p>
+            <w:pPr>
+              <w:pStyle w:val="Normal"/>
+              <w:jc w:val="center"/>
+              <w:pBdr>
+                <w:bottom w:val="none" w:sz="0" w:space="0" w:color="000000"/>
+                <w:top w:val="none" w:sz="0" w:space="0" w:color="000000"/>
+                <w:left w:val="none" w:sz="0" w:space="0" w:color="000000"/>
+                <w:right w:val="none" w:sz="0" w:space="0" w:color="000000"/>
+              </w:pBdr>
+              <w:spacing w:after="100" w:before="100" w:line="240"/>
+              <w:ind w:left="100" w:right="100" w:firstLine="0" w:firstLineChars="0"/>
+            </w:pPr>
+            <w:r>
+              <w:rPr>
+                <w:rFonts w:ascii="Helvetica" w:hAnsi="Helvetica" w:eastAsia="Helvetica" w:cs="Helvetica"/>
+                <w:i w:val="false"/>
+                <w:b w:val="false"/>
+                <w:u w:val="none"/>
+                <w:sz w:val="22"/>
+                <w:szCs w:val="22"/>
+                <w:color w:val="000000"/>
+              </w:rPr>
+              <w:t xml:space="preserve">2.67 ± 2.14</w:t>
+            </w:r>
+          </w:p>
+        </w:tc>
+        <w:tc>
+          <w:tcPr>
+            <w:tcBorders>
+              <w:bottom w:val="none" w:sz="0" w:space="0" w:color="000000"/>
+              <w:top w:val="none" w:sz="0" w:space="0" w:color="000000"/>
+              <w:left w:val="none" w:sz="0" w:space="0" w:color="000000"/>
+              <w:right w:val="none" w:sz="0" w:space="0" w:color="000000"/>
+            </w:tcBorders>
+            <w:shd w:val="clear" w:color="auto" w:fill="FFFFFF"/>
+            <w:tcMar>
+              <w:top w:w="0" w:type="dxa"/>
+              <w:bottom w:w="0" w:type="dxa"/>
+              <w:left w:w="0" w:type="dxa"/>
+              <w:right w:w="0" w:type="dxa"/>
+            </w:tcMar>
+            <w:vAlign w:val="center"/>
+          </w:tcPr>
+          <w:p>
+            <w:pPr>
+              <w:pStyle w:val="Normal"/>
+              <w:jc w:val="center"/>
+              <w:pBdr>
+                <w:bottom w:val="none" w:sz="0" w:space="0" w:color="000000"/>
+                <w:top w:val="none" w:sz="0" w:space="0" w:color="000000"/>
+                <w:left w:val="none" w:sz="0" w:space="0" w:color="000000"/>
+                <w:right w:val="none" w:sz="0" w:space="0" w:color="000000"/>
+              </w:pBdr>
+              <w:spacing w:after="100" w:before="100" w:line="240"/>
+              <w:ind w:left="100" w:right="100" w:firstLine="0" w:firstLineChars="0"/>
+            </w:pPr>
+            <w:r>
+              <w:rPr>
+                <w:rFonts w:ascii="Helvetica" w:hAnsi="Helvetica" w:eastAsia="Helvetica" w:cs="Helvetica"/>
+                <w:i w:val="false"/>
+                <w:b w:val="false"/>
+                <w:u w:val="none"/>
+                <w:sz w:val="22"/>
+                <w:szCs w:val="22"/>
+                <w:color w:val="000000"/>
+              </w:rPr>
+              <w:t xml:space="preserve">0.012 (Wilcoxon)</w:t>
+            </w:r>
+          </w:p>
+        </w:tc>
+      </w:tr>
+      <w:tr>
+        <w:trPr>
+          <w:trHeight w:val="616" w:hRule="auto"/>
+        </w:trPr>
+        body40
+        <w:tc>
+          <w:tcPr>
+            <w:tcBorders>
               <w:bottom w:val="single" w:sz="12" w:space="0" w:color="666666"/>
               <w:top w:val="none" w:sz="0" w:space="0" w:color="000000"/>
               <w:left w:val="none" w:sz="0" w:space="0" w:color="000000"/>
@@ -4892,7 +7440,7 @@
                 <w:szCs w:val="22"/>
                 <w:color w:val="000000"/>
               </w:rPr>
-              <w:t xml:space="preserve">100 [97.1, 100]</w:t>
+              <w:t xml:space="preserve">0.784 [0.286, 1.72]</w:t>
             </w:r>
           </w:p>
         </w:tc>
@@ -4936,7 +7484,7 @@
                 <w:szCs w:val="22"/>
                 <w:color w:val="000000"/>
               </w:rPr>
-              <w:t xml:space="preserve">100 [100, 100]</w:t>
+              <w:t xml:space="preserve">2.39 [1.09, 3.66]</w:t>
             </w:r>
           </w:p>
         </w:tc>

</xml_diff>

<commit_message>
Add components to Table 1
</commit_message>
<xml_diff>
--- a/outputs/Table1.docx
+++ b/outputs/Table1.docx
@@ -19,7 +19,7 @@
       <w:tblGrid>
         <w:gridCol w:w="6212"/>
         <w:gridCol w:w="2246"/>
-        <w:gridCol w:w="2001"/>
+        <w:gridCol w:w="2185"/>
         <w:gridCol w:w="2379"/>
       </w:tblGrid>
       <w:tr>
@@ -1158,7 +1158,7 @@
                 <w:szCs w:val="22"/>
                 <w:color w:val="000000"/>
               </w:rPr>
-              <w:t xml:space="preserve">0.177 (Fisher)</w:t>
+              <w:t xml:space="preserve">0.176 (Fisher)</w:t>
             </w:r>
           </w:p>
         </w:tc>
@@ -6443,7 +6443,7 @@
       </w:tr>
       <w:tr>
         <w:trPr>
-          <w:trHeight w:val="617" w:hRule="auto"/>
+          <w:trHeight w:val="621" w:hRule="auto"/>
         </w:trPr>
         body35
         <w:tc>
@@ -6486,7 +6486,7 @@
                 <w:szCs w:val="22"/>
                 <w:color w:val="000000"/>
               </w:rPr>
-              <w:t xml:space="preserve">Average Daily METs</w:t>
+              <w:t xml:space="preserve">Average Daily Total Step Count</w:t>
             </w:r>
           </w:p>
         </w:tc>
@@ -6712,95 +6712,95 @@
                 <w:szCs w:val="22"/>
                 <w:color w:val="000000"/>
               </w:rPr>
-              <w:t xml:space="preserve">1.34 ± 0.0578</w:t>
-            </w:r>
-          </w:p>
-        </w:tc>
-        <w:tc>
-          <w:tcPr>
-            <w:tcBorders>
-              <w:bottom w:val="none" w:sz="0" w:space="0" w:color="000000"/>
-              <w:top w:val="none" w:sz="0" w:space="0" w:color="000000"/>
-              <w:left w:val="none" w:sz="0" w:space="0" w:color="000000"/>
-              <w:right w:val="none" w:sz="0" w:space="0" w:color="000000"/>
-            </w:tcBorders>
-            <w:shd w:val="clear" w:color="auto" w:fill="FFFFFF"/>
-            <w:tcMar>
-              <w:top w:w="0" w:type="dxa"/>
-              <w:bottom w:w="0" w:type="dxa"/>
-              <w:left w:w="0" w:type="dxa"/>
-              <w:right w:w="0" w:type="dxa"/>
-            </w:tcMar>
-            <w:vAlign w:val="center"/>
-          </w:tcPr>
-          <w:p>
-            <w:pPr>
-              <w:pStyle w:val="Normal"/>
-              <w:jc w:val="center"/>
-              <w:pBdr>
-                <w:bottom w:val="none" w:sz="0" w:space="0" w:color="000000"/>
-                <w:top w:val="none" w:sz="0" w:space="0" w:color="000000"/>
-                <w:left w:val="none" w:sz="0" w:space="0" w:color="000000"/>
-                <w:right w:val="none" w:sz="0" w:space="0" w:color="000000"/>
-              </w:pBdr>
-              <w:spacing w:after="100" w:before="100" w:line="240"/>
-              <w:ind w:left="100" w:right="100" w:firstLine="0" w:firstLineChars="0"/>
-            </w:pPr>
-            <w:r>
-              <w:rPr>
-                <w:rFonts w:ascii="Helvetica" w:hAnsi="Helvetica" w:eastAsia="Helvetica" w:cs="Helvetica"/>
-                <w:i w:val="false"/>
-                <w:b w:val="false"/>
-                <w:u w:val="none"/>
-                <w:sz w:val="22"/>
-                <w:szCs w:val="22"/>
-                <w:color w:val="000000"/>
-              </w:rPr>
-              <w:t xml:space="preserve">1.39 ± 0.137</w:t>
-            </w:r>
-          </w:p>
-        </w:tc>
-        <w:tc>
-          <w:tcPr>
-            <w:tcBorders>
-              <w:bottom w:val="none" w:sz="0" w:space="0" w:color="000000"/>
-              <w:top w:val="none" w:sz="0" w:space="0" w:color="000000"/>
-              <w:left w:val="none" w:sz="0" w:space="0" w:color="000000"/>
-              <w:right w:val="none" w:sz="0" w:space="0" w:color="000000"/>
-            </w:tcBorders>
-            <w:shd w:val="clear" w:color="auto" w:fill="FFFFFF"/>
-            <w:tcMar>
-              <w:top w:w="0" w:type="dxa"/>
-              <w:bottom w:w="0" w:type="dxa"/>
-              <w:left w:w="0" w:type="dxa"/>
-              <w:right w:w="0" w:type="dxa"/>
-            </w:tcMar>
-            <w:vAlign w:val="center"/>
-          </w:tcPr>
-          <w:p>
-            <w:pPr>
-              <w:pStyle w:val="Normal"/>
-              <w:jc w:val="center"/>
-              <w:pBdr>
-                <w:bottom w:val="none" w:sz="0" w:space="0" w:color="000000"/>
-                <w:top w:val="none" w:sz="0" w:space="0" w:color="000000"/>
-                <w:left w:val="none" w:sz="0" w:space="0" w:color="000000"/>
-                <w:right w:val="none" w:sz="0" w:space="0" w:color="000000"/>
-              </w:pBdr>
-              <w:spacing w:after="100" w:before="100" w:line="240"/>
-              <w:ind w:left="100" w:right="100" w:firstLine="0" w:firstLineChars="0"/>
-            </w:pPr>
-            <w:r>
-              <w:rPr>
-                <w:rFonts w:ascii="Helvetica" w:hAnsi="Helvetica" w:eastAsia="Helvetica" w:cs="Helvetica"/>
-                <w:i w:val="false"/>
-                <w:b w:val="false"/>
-                <w:u w:val="none"/>
-                <w:sz w:val="22"/>
-                <w:szCs w:val="22"/>
-                <w:color w:val="000000"/>
-              </w:rPr>
-              <w:t xml:space="preserve">&amp;lt;0.001 (Wilcoxon)</w:t>
+              <w:t xml:space="preserve">5410 ± 3030</w:t>
+            </w:r>
+          </w:p>
+        </w:tc>
+        <w:tc>
+          <w:tcPr>
+            <w:tcBorders>
+              <w:bottom w:val="none" w:sz="0" w:space="0" w:color="000000"/>
+              <w:top w:val="none" w:sz="0" w:space="0" w:color="000000"/>
+              <w:left w:val="none" w:sz="0" w:space="0" w:color="000000"/>
+              <w:right w:val="none" w:sz="0" w:space="0" w:color="000000"/>
+            </w:tcBorders>
+            <w:shd w:val="clear" w:color="auto" w:fill="FFFFFF"/>
+            <w:tcMar>
+              <w:top w:w="0" w:type="dxa"/>
+              <w:bottom w:w="0" w:type="dxa"/>
+              <w:left w:w="0" w:type="dxa"/>
+              <w:right w:w="0" w:type="dxa"/>
+            </w:tcMar>
+            <w:vAlign w:val="center"/>
+          </w:tcPr>
+          <w:p>
+            <w:pPr>
+              <w:pStyle w:val="Normal"/>
+              <w:jc w:val="center"/>
+              <w:pBdr>
+                <w:bottom w:val="none" w:sz="0" w:space="0" w:color="000000"/>
+                <w:top w:val="none" w:sz="0" w:space="0" w:color="000000"/>
+                <w:left w:val="none" w:sz="0" w:space="0" w:color="000000"/>
+                <w:right w:val="none" w:sz="0" w:space="0" w:color="000000"/>
+              </w:pBdr>
+              <w:spacing w:after="100" w:before="100" w:line="240"/>
+              <w:ind w:left="100" w:right="100" w:firstLine="0" w:firstLineChars="0"/>
+            </w:pPr>
+            <w:r>
+              <w:rPr>
+                <w:rFonts w:ascii="Helvetica" w:hAnsi="Helvetica" w:eastAsia="Helvetica" w:cs="Helvetica"/>
+                <w:i w:val="false"/>
+                <w:b w:val="false"/>
+                <w:u w:val="none"/>
+                <w:sz w:val="22"/>
+                <w:szCs w:val="22"/>
+                <w:color w:val="000000"/>
+              </w:rPr>
+              <w:t xml:space="preserve">8840 ± 4460</w:t>
+            </w:r>
+          </w:p>
+        </w:tc>
+        <w:tc>
+          <w:tcPr>
+            <w:tcBorders>
+              <w:bottom w:val="none" w:sz="0" w:space="0" w:color="000000"/>
+              <w:top w:val="none" w:sz="0" w:space="0" w:color="000000"/>
+              <w:left w:val="none" w:sz="0" w:space="0" w:color="000000"/>
+              <w:right w:val="none" w:sz="0" w:space="0" w:color="000000"/>
+            </w:tcBorders>
+            <w:shd w:val="clear" w:color="auto" w:fill="FFFFFF"/>
+            <w:tcMar>
+              <w:top w:w="0" w:type="dxa"/>
+              <w:bottom w:w="0" w:type="dxa"/>
+              <w:left w:w="0" w:type="dxa"/>
+              <w:right w:w="0" w:type="dxa"/>
+            </w:tcMar>
+            <w:vAlign w:val="center"/>
+          </w:tcPr>
+          <w:p>
+            <w:pPr>
+              <w:pStyle w:val="Normal"/>
+              <w:jc w:val="center"/>
+              <w:pBdr>
+                <w:bottom w:val="none" w:sz="0" w:space="0" w:color="000000"/>
+                <w:top w:val="none" w:sz="0" w:space="0" w:color="000000"/>
+                <w:left w:val="none" w:sz="0" w:space="0" w:color="000000"/>
+                <w:right w:val="none" w:sz="0" w:space="0" w:color="000000"/>
+              </w:pBdr>
+              <w:spacing w:after="100" w:before="100" w:line="240"/>
+              <w:ind w:left="100" w:right="100" w:firstLine="0" w:firstLineChars="0"/>
+            </w:pPr>
+            <w:r>
+              <w:rPr>
+                <w:rFonts w:ascii="Helvetica" w:hAnsi="Helvetica" w:eastAsia="Helvetica" w:cs="Helvetica"/>
+                <w:i w:val="false"/>
+                <w:b w:val="false"/>
+                <w:u w:val="none"/>
+                <w:sz w:val="22"/>
+                <w:szCs w:val="22"/>
+                <w:color w:val="000000"/>
+              </w:rPr>
+              <w:t xml:space="preserve">0.006 (Wilcoxon)</w:t>
             </w:r>
           </w:p>
         </w:tc>
@@ -6894,51 +6894,51 @@
                 <w:szCs w:val="22"/>
                 <w:color w:val="000000"/>
               </w:rPr>
-              <w:t xml:space="preserve">1.32 [1.30, 1.37]</w:t>
-            </w:r>
-          </w:p>
-        </w:tc>
-        <w:tc>
-          <w:tcPr>
-            <w:tcBorders>
-              <w:bottom w:val="none" w:sz="0" w:space="0" w:color="000000"/>
-              <w:top w:val="none" w:sz="0" w:space="0" w:color="000000"/>
-              <w:left w:val="none" w:sz="0" w:space="0" w:color="000000"/>
-              <w:right w:val="none" w:sz="0" w:space="0" w:color="000000"/>
-            </w:tcBorders>
-            <w:shd w:val="clear" w:color="auto" w:fill="FFFFFF"/>
-            <w:tcMar>
-              <w:top w:w="0" w:type="dxa"/>
-              <w:bottom w:w="0" w:type="dxa"/>
-              <w:left w:w="0" w:type="dxa"/>
-              <w:right w:w="0" w:type="dxa"/>
-            </w:tcMar>
-            <w:vAlign w:val="center"/>
-          </w:tcPr>
-          <w:p>
-            <w:pPr>
-              <w:pStyle w:val="Normal"/>
-              <w:jc w:val="center"/>
-              <w:pBdr>
-                <w:bottom w:val="none" w:sz="0" w:space="0" w:color="000000"/>
-                <w:top w:val="none" w:sz="0" w:space="0" w:color="000000"/>
-                <w:left w:val="none" w:sz="0" w:space="0" w:color="000000"/>
-                <w:right w:val="none" w:sz="0" w:space="0" w:color="000000"/>
-              </w:pBdr>
-              <w:spacing w:after="100" w:before="100" w:line="240"/>
-              <w:ind w:left="100" w:right="100" w:firstLine="0" w:firstLineChars="0"/>
-            </w:pPr>
-            <w:r>
-              <w:rPr>
-                <w:rFonts w:ascii="Helvetica" w:hAnsi="Helvetica" w:eastAsia="Helvetica" w:cs="Helvetica"/>
-                <w:i w:val="false"/>
-                <w:b w:val="false"/>
-                <w:u w:val="none"/>
-                <w:sz w:val="22"/>
-                <w:szCs w:val="22"/>
-                <w:color w:val="000000"/>
-              </w:rPr>
-              <w:t xml:space="preserve">1.41 [1.37, 1.44]</w:t>
+              <w:t xml:space="preserve">4510 [3070, 6320]</w:t>
+            </w:r>
+          </w:p>
+        </w:tc>
+        <w:tc>
+          <w:tcPr>
+            <w:tcBorders>
+              <w:bottom w:val="none" w:sz="0" w:space="0" w:color="000000"/>
+              <w:top w:val="none" w:sz="0" w:space="0" w:color="000000"/>
+              <w:left w:val="none" w:sz="0" w:space="0" w:color="000000"/>
+              <w:right w:val="none" w:sz="0" w:space="0" w:color="000000"/>
+            </w:tcBorders>
+            <w:shd w:val="clear" w:color="auto" w:fill="FFFFFF"/>
+            <w:tcMar>
+              <w:top w:w="0" w:type="dxa"/>
+              <w:bottom w:w="0" w:type="dxa"/>
+              <w:left w:w="0" w:type="dxa"/>
+              <w:right w:w="0" w:type="dxa"/>
+            </w:tcMar>
+            <w:vAlign w:val="center"/>
+          </w:tcPr>
+          <w:p>
+            <w:pPr>
+              <w:pStyle w:val="Normal"/>
+              <w:jc w:val="center"/>
+              <w:pBdr>
+                <w:bottom w:val="none" w:sz="0" w:space="0" w:color="000000"/>
+                <w:top w:val="none" w:sz="0" w:space="0" w:color="000000"/>
+                <w:left w:val="none" w:sz="0" w:space="0" w:color="000000"/>
+                <w:right w:val="none" w:sz="0" w:space="0" w:color="000000"/>
+              </w:pBdr>
+              <w:spacing w:after="100" w:before="100" w:line="240"/>
+              <w:ind w:left="100" w:right="100" w:firstLine="0" w:firstLineChars="0"/>
+            </w:pPr>
+            <w:r>
+              <w:rPr>
+                <w:rFonts w:ascii="Helvetica" w:hAnsi="Helvetica" w:eastAsia="Helvetica" w:cs="Helvetica"/>
+                <w:i w:val="false"/>
+                <w:b w:val="false"/>
+                <w:u w:val="none"/>
+                <w:sz w:val="22"/>
+                <w:szCs w:val="22"/>
+                <w:color w:val="000000"/>
+              </w:rPr>
+              <w:t xml:space="preserve">8350 [6260, 9860]</w:t>
             </w:r>
           </w:p>
         </w:tc>
@@ -6989,7 +6989,7 @@
       </w:tr>
       <w:tr>
         <w:trPr>
-          <w:trHeight w:val="619" w:hRule="auto"/>
+          <w:trHeight w:val="617" w:hRule="auto"/>
         </w:trPr>
         body38
         <w:tc>
@@ -7032,7 +7032,7 @@
                 <w:szCs w:val="22"/>
                 <w:color w:val="000000"/>
               </w:rPr>
-              <w:t xml:space="preserve">Average Percent of Time in MVPA</w:t>
+              <w:t xml:space="preserve">Average Daily METs</w:t>
             </w:r>
           </w:p>
         </w:tc>
@@ -7258,95 +7258,95 @@
                 <w:szCs w:val="22"/>
                 <w:color w:val="000000"/>
               </w:rPr>
-              <w:t xml:space="preserve">1.15 ± 1.09</w:t>
-            </w:r>
-          </w:p>
-        </w:tc>
-        <w:tc>
-          <w:tcPr>
-            <w:tcBorders>
-              <w:bottom w:val="none" w:sz="0" w:space="0" w:color="000000"/>
-              <w:top w:val="none" w:sz="0" w:space="0" w:color="000000"/>
-              <w:left w:val="none" w:sz="0" w:space="0" w:color="000000"/>
-              <w:right w:val="none" w:sz="0" w:space="0" w:color="000000"/>
-            </w:tcBorders>
-            <w:shd w:val="clear" w:color="auto" w:fill="FFFFFF"/>
-            <w:tcMar>
-              <w:top w:w="0" w:type="dxa"/>
-              <w:bottom w:w="0" w:type="dxa"/>
-              <w:left w:w="0" w:type="dxa"/>
-              <w:right w:w="0" w:type="dxa"/>
-            </w:tcMar>
-            <w:vAlign w:val="center"/>
-          </w:tcPr>
-          <w:p>
-            <w:pPr>
-              <w:pStyle w:val="Normal"/>
-              <w:jc w:val="center"/>
-              <w:pBdr>
-                <w:bottom w:val="none" w:sz="0" w:space="0" w:color="000000"/>
-                <w:top w:val="none" w:sz="0" w:space="0" w:color="000000"/>
-                <w:left w:val="none" w:sz="0" w:space="0" w:color="000000"/>
-                <w:right w:val="none" w:sz="0" w:space="0" w:color="000000"/>
-              </w:pBdr>
-              <w:spacing w:after="100" w:before="100" w:line="240"/>
-              <w:ind w:left="100" w:right="100" w:firstLine="0" w:firstLineChars="0"/>
-            </w:pPr>
-            <w:r>
-              <w:rPr>
-                <w:rFonts w:ascii="Helvetica" w:hAnsi="Helvetica" w:eastAsia="Helvetica" w:cs="Helvetica"/>
-                <w:i w:val="false"/>
-                <w:b w:val="false"/>
-                <w:u w:val="none"/>
-                <w:sz w:val="22"/>
-                <w:szCs w:val="22"/>
-                <w:color w:val="000000"/>
-              </w:rPr>
-              <w:t xml:space="preserve">2.67 ± 2.14</w:t>
-            </w:r>
-          </w:p>
-        </w:tc>
-        <w:tc>
-          <w:tcPr>
-            <w:tcBorders>
-              <w:bottom w:val="none" w:sz="0" w:space="0" w:color="000000"/>
-              <w:top w:val="none" w:sz="0" w:space="0" w:color="000000"/>
-              <w:left w:val="none" w:sz="0" w:space="0" w:color="000000"/>
-              <w:right w:val="none" w:sz="0" w:space="0" w:color="000000"/>
-            </w:tcBorders>
-            <w:shd w:val="clear" w:color="auto" w:fill="FFFFFF"/>
-            <w:tcMar>
-              <w:top w:w="0" w:type="dxa"/>
-              <w:bottom w:w="0" w:type="dxa"/>
-              <w:left w:w="0" w:type="dxa"/>
-              <w:right w:w="0" w:type="dxa"/>
-            </w:tcMar>
-            <w:vAlign w:val="center"/>
-          </w:tcPr>
-          <w:p>
-            <w:pPr>
-              <w:pStyle w:val="Normal"/>
-              <w:jc w:val="center"/>
-              <w:pBdr>
-                <w:bottom w:val="none" w:sz="0" w:space="0" w:color="000000"/>
-                <w:top w:val="none" w:sz="0" w:space="0" w:color="000000"/>
-                <w:left w:val="none" w:sz="0" w:space="0" w:color="000000"/>
-                <w:right w:val="none" w:sz="0" w:space="0" w:color="000000"/>
-              </w:pBdr>
-              <w:spacing w:after="100" w:before="100" w:line="240"/>
-              <w:ind w:left="100" w:right="100" w:firstLine="0" w:firstLineChars="0"/>
-            </w:pPr>
-            <w:r>
-              <w:rPr>
-                <w:rFonts w:ascii="Helvetica" w:hAnsi="Helvetica" w:eastAsia="Helvetica" w:cs="Helvetica"/>
-                <w:i w:val="false"/>
-                <w:b w:val="false"/>
-                <w:u w:val="none"/>
-                <w:sz w:val="22"/>
-                <w:szCs w:val="22"/>
-                <w:color w:val="000000"/>
-              </w:rPr>
-              <w:t xml:space="preserve">0.012 (Wilcoxon)</w:t>
+              <w:t xml:space="preserve">1.34 ± 0.0578</w:t>
+            </w:r>
+          </w:p>
+        </w:tc>
+        <w:tc>
+          <w:tcPr>
+            <w:tcBorders>
+              <w:bottom w:val="none" w:sz="0" w:space="0" w:color="000000"/>
+              <w:top w:val="none" w:sz="0" w:space="0" w:color="000000"/>
+              <w:left w:val="none" w:sz="0" w:space="0" w:color="000000"/>
+              <w:right w:val="none" w:sz="0" w:space="0" w:color="000000"/>
+            </w:tcBorders>
+            <w:shd w:val="clear" w:color="auto" w:fill="FFFFFF"/>
+            <w:tcMar>
+              <w:top w:w="0" w:type="dxa"/>
+              <w:bottom w:w="0" w:type="dxa"/>
+              <w:left w:w="0" w:type="dxa"/>
+              <w:right w:w="0" w:type="dxa"/>
+            </w:tcMar>
+            <w:vAlign w:val="center"/>
+          </w:tcPr>
+          <w:p>
+            <w:pPr>
+              <w:pStyle w:val="Normal"/>
+              <w:jc w:val="center"/>
+              <w:pBdr>
+                <w:bottom w:val="none" w:sz="0" w:space="0" w:color="000000"/>
+                <w:top w:val="none" w:sz="0" w:space="0" w:color="000000"/>
+                <w:left w:val="none" w:sz="0" w:space="0" w:color="000000"/>
+                <w:right w:val="none" w:sz="0" w:space="0" w:color="000000"/>
+              </w:pBdr>
+              <w:spacing w:after="100" w:before="100" w:line="240"/>
+              <w:ind w:left="100" w:right="100" w:firstLine="0" w:firstLineChars="0"/>
+            </w:pPr>
+            <w:r>
+              <w:rPr>
+                <w:rFonts w:ascii="Helvetica" w:hAnsi="Helvetica" w:eastAsia="Helvetica" w:cs="Helvetica"/>
+                <w:i w:val="false"/>
+                <w:b w:val="false"/>
+                <w:u w:val="none"/>
+                <w:sz w:val="22"/>
+                <w:szCs w:val="22"/>
+                <w:color w:val="000000"/>
+              </w:rPr>
+              <w:t xml:space="preserve">1.39 ± 0.137</w:t>
+            </w:r>
+          </w:p>
+        </w:tc>
+        <w:tc>
+          <w:tcPr>
+            <w:tcBorders>
+              <w:bottom w:val="none" w:sz="0" w:space="0" w:color="000000"/>
+              <w:top w:val="none" w:sz="0" w:space="0" w:color="000000"/>
+              <w:left w:val="none" w:sz="0" w:space="0" w:color="000000"/>
+              <w:right w:val="none" w:sz="0" w:space="0" w:color="000000"/>
+            </w:tcBorders>
+            <w:shd w:val="clear" w:color="auto" w:fill="FFFFFF"/>
+            <w:tcMar>
+              <w:top w:w="0" w:type="dxa"/>
+              <w:bottom w:w="0" w:type="dxa"/>
+              <w:left w:w="0" w:type="dxa"/>
+              <w:right w:w="0" w:type="dxa"/>
+            </w:tcMar>
+            <w:vAlign w:val="center"/>
+          </w:tcPr>
+          <w:p>
+            <w:pPr>
+              <w:pStyle w:val="Normal"/>
+              <w:jc w:val="center"/>
+              <w:pBdr>
+                <w:bottom w:val="none" w:sz="0" w:space="0" w:color="000000"/>
+                <w:top w:val="none" w:sz="0" w:space="0" w:color="000000"/>
+                <w:left w:val="none" w:sz="0" w:space="0" w:color="000000"/>
+                <w:right w:val="none" w:sz="0" w:space="0" w:color="000000"/>
+              </w:pBdr>
+              <w:spacing w:after="100" w:before="100" w:line="240"/>
+              <w:ind w:left="100" w:right="100" w:firstLine="0" w:firstLineChars="0"/>
+            </w:pPr>
+            <w:r>
+              <w:rPr>
+                <w:rFonts w:ascii="Helvetica" w:hAnsi="Helvetica" w:eastAsia="Helvetica" w:cs="Helvetica"/>
+                <w:i w:val="false"/>
+                <w:b w:val="false"/>
+                <w:u w:val="none"/>
+                <w:sz w:val="22"/>
+                <w:szCs w:val="22"/>
+                <w:color w:val="000000"/>
+              </w:rPr>
+              <w:t xml:space="preserve">&amp;lt;0.001 (Wilcoxon)</w:t>
             </w:r>
           </w:p>
         </w:tc>
@@ -7356,6 +7356,552 @@
           <w:trHeight w:val="616" w:hRule="auto"/>
         </w:trPr>
         body40
+        <w:tc>
+          <w:tcPr>
+            <w:tcBorders>
+              <w:bottom w:val="none" w:sz="0" w:space="0" w:color="000000"/>
+              <w:top w:val="none" w:sz="0" w:space="0" w:color="000000"/>
+              <w:left w:val="none" w:sz="0" w:space="0" w:color="000000"/>
+              <w:right w:val="none" w:sz="0" w:space="0" w:color="000000"/>
+            </w:tcBorders>
+            <w:shd w:val="clear" w:color="auto" w:fill="FFFFFF"/>
+            <w:tcMar>
+              <w:top w:w="0" w:type="dxa"/>
+              <w:bottom w:w="0" w:type="dxa"/>
+              <w:left w:w="0" w:type="dxa"/>
+              <w:right w:w="0" w:type="dxa"/>
+            </w:tcMar>
+            <w:vAlign w:val="center"/>
+          </w:tcPr>
+          <w:p>
+            <w:pPr>
+              <w:pStyle w:val="Normal"/>
+              <w:jc w:val="left"/>
+              <w:pBdr>
+                <w:bottom w:val="none" w:sz="0" w:space="0" w:color="000000"/>
+                <w:top w:val="none" w:sz="0" w:space="0" w:color="000000"/>
+                <w:left w:val="none" w:sz="0" w:space="0" w:color="000000"/>
+                <w:right w:val="none" w:sz="0" w:space="0" w:color="000000"/>
+              </w:pBdr>
+              <w:spacing w:after="100" w:before="100" w:line="240"/>
+              <w:ind w:left="100" w:right="100" w:firstLine="0" w:firstLineChars="0"/>
+            </w:pPr>
+            <w:r>
+              <w:rPr>
+                <w:rFonts w:ascii="Helvetica" w:hAnsi="Helvetica" w:eastAsia="Helvetica" w:cs="Helvetica"/>
+                <w:i w:val="false"/>
+                <w:b w:val="false"/>
+                <w:u w:val="none"/>
+                <w:sz w:val="22"/>
+                <w:szCs w:val="22"/>
+                <w:color w:val="000000"/>
+              </w:rPr>
+              <w:t xml:space="preserve">  Median [IQR]</w:t>
+            </w:r>
+          </w:p>
+        </w:tc>
+        <w:tc>
+          <w:tcPr>
+            <w:tcBorders>
+              <w:bottom w:val="none" w:sz="0" w:space="0" w:color="000000"/>
+              <w:top w:val="none" w:sz="0" w:space="0" w:color="000000"/>
+              <w:left w:val="none" w:sz="0" w:space="0" w:color="000000"/>
+              <w:right w:val="none" w:sz="0" w:space="0" w:color="000000"/>
+            </w:tcBorders>
+            <w:shd w:val="clear" w:color="auto" w:fill="FFFFFF"/>
+            <w:tcMar>
+              <w:top w:w="0" w:type="dxa"/>
+              <w:bottom w:w="0" w:type="dxa"/>
+              <w:left w:w="0" w:type="dxa"/>
+              <w:right w:w="0" w:type="dxa"/>
+            </w:tcMar>
+            <w:vAlign w:val="center"/>
+          </w:tcPr>
+          <w:p>
+            <w:pPr>
+              <w:pStyle w:val="Normal"/>
+              <w:jc w:val="center"/>
+              <w:pBdr>
+                <w:bottom w:val="none" w:sz="0" w:space="0" w:color="000000"/>
+                <w:top w:val="none" w:sz="0" w:space="0" w:color="000000"/>
+                <w:left w:val="none" w:sz="0" w:space="0" w:color="000000"/>
+                <w:right w:val="none" w:sz="0" w:space="0" w:color="000000"/>
+              </w:pBdr>
+              <w:spacing w:after="100" w:before="100" w:line="240"/>
+              <w:ind w:left="100" w:right="100" w:firstLine="0" w:firstLineChars="0"/>
+            </w:pPr>
+            <w:r>
+              <w:rPr>
+                <w:rFonts w:ascii="Helvetica" w:hAnsi="Helvetica" w:eastAsia="Helvetica" w:cs="Helvetica"/>
+                <w:i w:val="false"/>
+                <w:b w:val="false"/>
+                <w:u w:val="none"/>
+                <w:sz w:val="22"/>
+                <w:szCs w:val="22"/>
+                <w:color w:val="000000"/>
+              </w:rPr>
+              <w:t xml:space="preserve">1.32 [1.30, 1.37]</w:t>
+            </w:r>
+          </w:p>
+        </w:tc>
+        <w:tc>
+          <w:tcPr>
+            <w:tcBorders>
+              <w:bottom w:val="none" w:sz="0" w:space="0" w:color="000000"/>
+              <w:top w:val="none" w:sz="0" w:space="0" w:color="000000"/>
+              <w:left w:val="none" w:sz="0" w:space="0" w:color="000000"/>
+              <w:right w:val="none" w:sz="0" w:space="0" w:color="000000"/>
+            </w:tcBorders>
+            <w:shd w:val="clear" w:color="auto" w:fill="FFFFFF"/>
+            <w:tcMar>
+              <w:top w:w="0" w:type="dxa"/>
+              <w:bottom w:w="0" w:type="dxa"/>
+              <w:left w:w="0" w:type="dxa"/>
+              <w:right w:w="0" w:type="dxa"/>
+            </w:tcMar>
+            <w:vAlign w:val="center"/>
+          </w:tcPr>
+          <w:p>
+            <w:pPr>
+              <w:pStyle w:val="Normal"/>
+              <w:jc w:val="center"/>
+              <w:pBdr>
+                <w:bottom w:val="none" w:sz="0" w:space="0" w:color="000000"/>
+                <w:top w:val="none" w:sz="0" w:space="0" w:color="000000"/>
+                <w:left w:val="none" w:sz="0" w:space="0" w:color="000000"/>
+                <w:right w:val="none" w:sz="0" w:space="0" w:color="000000"/>
+              </w:pBdr>
+              <w:spacing w:after="100" w:before="100" w:line="240"/>
+              <w:ind w:left="100" w:right="100" w:firstLine="0" w:firstLineChars="0"/>
+            </w:pPr>
+            <w:r>
+              <w:rPr>
+                <w:rFonts w:ascii="Helvetica" w:hAnsi="Helvetica" w:eastAsia="Helvetica" w:cs="Helvetica"/>
+                <w:i w:val="false"/>
+                <w:b w:val="false"/>
+                <w:u w:val="none"/>
+                <w:sz w:val="22"/>
+                <w:szCs w:val="22"/>
+                <w:color w:val="000000"/>
+              </w:rPr>
+              <w:t xml:space="preserve">1.41 [1.37, 1.44]</w:t>
+            </w:r>
+          </w:p>
+        </w:tc>
+        <w:tc>
+          <w:tcPr>
+            <w:tcBorders>
+              <w:bottom w:val="none" w:sz="0" w:space="0" w:color="000000"/>
+              <w:top w:val="none" w:sz="0" w:space="0" w:color="000000"/>
+              <w:left w:val="none" w:sz="0" w:space="0" w:color="000000"/>
+              <w:right w:val="none" w:sz="0" w:space="0" w:color="000000"/>
+            </w:tcBorders>
+            <w:shd w:val="clear" w:color="auto" w:fill="FFFFFF"/>
+            <w:tcMar>
+              <w:top w:w="0" w:type="dxa"/>
+              <w:bottom w:w="0" w:type="dxa"/>
+              <w:left w:w="0" w:type="dxa"/>
+              <w:right w:w="0" w:type="dxa"/>
+            </w:tcMar>
+            <w:vAlign w:val="center"/>
+          </w:tcPr>
+          <w:p>
+            <w:pPr>
+              <w:pStyle w:val="Normal"/>
+              <w:jc w:val="center"/>
+              <w:pBdr>
+                <w:bottom w:val="none" w:sz="0" w:space="0" w:color="000000"/>
+                <w:top w:val="none" w:sz="0" w:space="0" w:color="000000"/>
+                <w:left w:val="none" w:sz="0" w:space="0" w:color="000000"/>
+                <w:right w:val="none" w:sz="0" w:space="0" w:color="000000"/>
+              </w:pBdr>
+              <w:spacing w:after="100" w:before="100" w:line="240"/>
+              <w:ind w:left="100" w:right="100" w:firstLine="0" w:firstLineChars="0"/>
+            </w:pPr>
+            <w:r>
+              <w:rPr>
+                <w:rFonts w:ascii="Helvetica" w:hAnsi="Helvetica" w:eastAsia="Helvetica" w:cs="Helvetica"/>
+                <w:i w:val="false"/>
+                <w:b w:val="false"/>
+                <w:u w:val="none"/>
+                <w:sz w:val="22"/>
+                <w:szCs w:val="22"/>
+                <w:color w:val="000000"/>
+              </w:rPr>
+              <w:t xml:space="preserve"/>
+            </w:r>
+          </w:p>
+        </w:tc>
+      </w:tr>
+      <w:tr>
+        <w:trPr>
+          <w:trHeight w:val="619" w:hRule="auto"/>
+        </w:trPr>
+        body41
+        <w:tc>
+          <w:tcPr>
+            <w:tcBorders>
+              <w:bottom w:val="none" w:sz="0" w:space="0" w:color="000000"/>
+              <w:top w:val="none" w:sz="0" w:space="0" w:color="000000"/>
+              <w:left w:val="none" w:sz="0" w:space="0" w:color="000000"/>
+              <w:right w:val="none" w:sz="0" w:space="0" w:color="000000"/>
+            </w:tcBorders>
+            <w:shd w:val="clear" w:color="auto" w:fill="FFFFFF"/>
+            <w:tcMar>
+              <w:top w:w="0" w:type="dxa"/>
+              <w:bottom w:w="0" w:type="dxa"/>
+              <w:left w:w="0" w:type="dxa"/>
+              <w:right w:w="0" w:type="dxa"/>
+            </w:tcMar>
+            <w:vAlign w:val="center"/>
+          </w:tcPr>
+          <w:p>
+            <w:pPr>
+              <w:pStyle w:val="Normal"/>
+              <w:jc w:val="left"/>
+              <w:pBdr>
+                <w:bottom w:val="none" w:sz="0" w:space="0" w:color="000000"/>
+                <w:top w:val="none" w:sz="0" w:space="0" w:color="000000"/>
+                <w:left w:val="none" w:sz="0" w:space="0" w:color="000000"/>
+                <w:right w:val="none" w:sz="0" w:space="0" w:color="000000"/>
+              </w:pBdr>
+              <w:spacing w:after="100" w:before="100" w:line="240"/>
+              <w:ind w:left="100" w:right="100" w:firstLine="0" w:firstLineChars="0"/>
+            </w:pPr>
+            <w:r>
+              <w:rPr>
+                <w:rFonts w:ascii="Helvetica" w:hAnsi="Helvetica" w:eastAsia="Helvetica" w:cs="Helvetica"/>
+                <w:i w:val="false"/>
+                <w:b w:val="true"/>
+                <w:u w:val="none"/>
+                <w:sz w:val="22"/>
+                <w:szCs w:val="22"/>
+                <w:color w:val="000000"/>
+              </w:rPr>
+              <w:t xml:space="preserve">Average Percent of Time in MVPA</w:t>
+            </w:r>
+          </w:p>
+        </w:tc>
+        <w:tc>
+          <w:tcPr>
+            <w:tcBorders>
+              <w:bottom w:val="none" w:sz="0" w:space="0" w:color="000000"/>
+              <w:top w:val="none" w:sz="0" w:space="0" w:color="000000"/>
+              <w:left w:val="none" w:sz="0" w:space="0" w:color="000000"/>
+              <w:right w:val="none" w:sz="0" w:space="0" w:color="000000"/>
+            </w:tcBorders>
+            <w:shd w:val="clear" w:color="auto" w:fill="FFFFFF"/>
+            <w:tcMar>
+              <w:top w:w="0" w:type="dxa"/>
+              <w:bottom w:w="0" w:type="dxa"/>
+              <w:left w:w="0" w:type="dxa"/>
+              <w:right w:w="0" w:type="dxa"/>
+            </w:tcMar>
+            <w:vAlign w:val="center"/>
+          </w:tcPr>
+          <w:p>
+            <w:pPr>
+              <w:pStyle w:val="Normal"/>
+              <w:jc w:val="center"/>
+              <w:pBdr>
+                <w:bottom w:val="none" w:sz="0" w:space="0" w:color="000000"/>
+                <w:top w:val="none" w:sz="0" w:space="0" w:color="000000"/>
+                <w:left w:val="none" w:sz="0" w:space="0" w:color="000000"/>
+                <w:right w:val="none" w:sz="0" w:space="0" w:color="000000"/>
+              </w:pBdr>
+              <w:spacing w:after="100" w:before="100" w:line="240"/>
+              <w:ind w:left="100" w:right="100" w:firstLine="0" w:firstLineChars="0"/>
+            </w:pPr>
+            <w:r>
+              <w:rPr>
+                <w:rFonts w:ascii="Helvetica" w:hAnsi="Helvetica" w:eastAsia="Helvetica" w:cs="Helvetica"/>
+                <w:i w:val="false"/>
+                <w:b w:val="false"/>
+                <w:u w:val="none"/>
+                <w:sz w:val="22"/>
+                <w:szCs w:val="22"/>
+                <w:color w:val="000000"/>
+              </w:rPr>
+              <w:t xml:space="preserve"/>
+            </w:r>
+          </w:p>
+        </w:tc>
+        <w:tc>
+          <w:tcPr>
+            <w:tcBorders>
+              <w:bottom w:val="none" w:sz="0" w:space="0" w:color="000000"/>
+              <w:top w:val="none" w:sz="0" w:space="0" w:color="000000"/>
+              <w:left w:val="none" w:sz="0" w:space="0" w:color="000000"/>
+              <w:right w:val="none" w:sz="0" w:space="0" w:color="000000"/>
+            </w:tcBorders>
+            <w:shd w:val="clear" w:color="auto" w:fill="FFFFFF"/>
+            <w:tcMar>
+              <w:top w:w="0" w:type="dxa"/>
+              <w:bottom w:w="0" w:type="dxa"/>
+              <w:left w:w="0" w:type="dxa"/>
+              <w:right w:w="0" w:type="dxa"/>
+            </w:tcMar>
+            <w:vAlign w:val="center"/>
+          </w:tcPr>
+          <w:p>
+            <w:pPr>
+              <w:pStyle w:val="Normal"/>
+              <w:jc w:val="center"/>
+              <w:pBdr>
+                <w:bottom w:val="none" w:sz="0" w:space="0" w:color="000000"/>
+                <w:top w:val="none" w:sz="0" w:space="0" w:color="000000"/>
+                <w:left w:val="none" w:sz="0" w:space="0" w:color="000000"/>
+                <w:right w:val="none" w:sz="0" w:space="0" w:color="000000"/>
+              </w:pBdr>
+              <w:spacing w:after="100" w:before="100" w:line="240"/>
+              <w:ind w:left="100" w:right="100" w:firstLine="0" w:firstLineChars="0"/>
+            </w:pPr>
+            <w:r>
+              <w:rPr>
+                <w:rFonts w:ascii="Helvetica" w:hAnsi="Helvetica" w:eastAsia="Helvetica" w:cs="Helvetica"/>
+                <w:i w:val="false"/>
+                <w:b w:val="false"/>
+                <w:u w:val="none"/>
+                <w:sz w:val="22"/>
+                <w:szCs w:val="22"/>
+                <w:color w:val="000000"/>
+              </w:rPr>
+              <w:t xml:space="preserve"/>
+            </w:r>
+          </w:p>
+        </w:tc>
+        <w:tc>
+          <w:tcPr>
+            <w:tcBorders>
+              <w:bottom w:val="none" w:sz="0" w:space="0" w:color="000000"/>
+              <w:top w:val="none" w:sz="0" w:space="0" w:color="000000"/>
+              <w:left w:val="none" w:sz="0" w:space="0" w:color="000000"/>
+              <w:right w:val="none" w:sz="0" w:space="0" w:color="000000"/>
+            </w:tcBorders>
+            <w:shd w:val="clear" w:color="auto" w:fill="FFFFFF"/>
+            <w:tcMar>
+              <w:top w:w="0" w:type="dxa"/>
+              <w:bottom w:w="0" w:type="dxa"/>
+              <w:left w:w="0" w:type="dxa"/>
+              <w:right w:w="0" w:type="dxa"/>
+            </w:tcMar>
+            <w:vAlign w:val="center"/>
+          </w:tcPr>
+          <w:p>
+            <w:pPr>
+              <w:pStyle w:val="Normal"/>
+              <w:jc w:val="center"/>
+              <w:pBdr>
+                <w:bottom w:val="none" w:sz="0" w:space="0" w:color="000000"/>
+                <w:top w:val="none" w:sz="0" w:space="0" w:color="000000"/>
+                <w:left w:val="none" w:sz="0" w:space="0" w:color="000000"/>
+                <w:right w:val="none" w:sz="0" w:space="0" w:color="000000"/>
+              </w:pBdr>
+              <w:spacing w:after="100" w:before="100" w:line="240"/>
+              <w:ind w:left="100" w:right="100" w:firstLine="0" w:firstLineChars="0"/>
+            </w:pPr>
+            <w:r>
+              <w:rPr>
+                <w:rFonts w:ascii="Helvetica" w:hAnsi="Helvetica" w:eastAsia="Helvetica" w:cs="Helvetica"/>
+                <w:i w:val="false"/>
+                <w:b w:val="false"/>
+                <w:u w:val="none"/>
+                <w:sz w:val="22"/>
+                <w:szCs w:val="22"/>
+                <w:color w:val="000000"/>
+              </w:rPr>
+              <w:t xml:space="preserve"/>
+            </w:r>
+          </w:p>
+        </w:tc>
+      </w:tr>
+      <w:tr>
+        <w:trPr>
+          <w:trHeight w:val="616" w:hRule="auto"/>
+        </w:trPr>
+        body42
+        <w:tc>
+          <w:tcPr>
+            <w:tcBorders>
+              <w:bottom w:val="none" w:sz="0" w:space="0" w:color="000000"/>
+              <w:top w:val="none" w:sz="0" w:space="0" w:color="000000"/>
+              <w:left w:val="none" w:sz="0" w:space="0" w:color="000000"/>
+              <w:right w:val="none" w:sz="0" w:space="0" w:color="000000"/>
+            </w:tcBorders>
+            <w:shd w:val="clear" w:color="auto" w:fill="FFFFFF"/>
+            <w:tcMar>
+              <w:top w:w="0" w:type="dxa"/>
+              <w:bottom w:w="0" w:type="dxa"/>
+              <w:left w:w="0" w:type="dxa"/>
+              <w:right w:w="0" w:type="dxa"/>
+            </w:tcMar>
+            <w:vAlign w:val="center"/>
+          </w:tcPr>
+          <w:p>
+            <w:pPr>
+              <w:pStyle w:val="Normal"/>
+              <w:jc w:val="left"/>
+              <w:pBdr>
+                <w:bottom w:val="none" w:sz="0" w:space="0" w:color="000000"/>
+                <w:top w:val="none" w:sz="0" w:space="0" w:color="000000"/>
+                <w:left w:val="none" w:sz="0" w:space="0" w:color="000000"/>
+                <w:right w:val="none" w:sz="0" w:space="0" w:color="000000"/>
+              </w:pBdr>
+              <w:spacing w:after="100" w:before="100" w:line="240"/>
+              <w:ind w:left="100" w:right="100" w:firstLine="0" w:firstLineChars="0"/>
+            </w:pPr>
+            <w:r>
+              <w:rPr>
+                <w:rFonts w:ascii="Helvetica" w:hAnsi="Helvetica" w:eastAsia="Helvetica" w:cs="Helvetica"/>
+                <w:i w:val="false"/>
+                <w:b w:val="false"/>
+                <w:u w:val="none"/>
+                <w:sz w:val="22"/>
+                <w:szCs w:val="22"/>
+                <w:color w:val="000000"/>
+              </w:rPr>
+              <w:t xml:space="preserve">  Mean ± SD</w:t>
+            </w:r>
+          </w:p>
+        </w:tc>
+        <w:tc>
+          <w:tcPr>
+            <w:tcBorders>
+              <w:bottom w:val="none" w:sz="0" w:space="0" w:color="000000"/>
+              <w:top w:val="none" w:sz="0" w:space="0" w:color="000000"/>
+              <w:left w:val="none" w:sz="0" w:space="0" w:color="000000"/>
+              <w:right w:val="none" w:sz="0" w:space="0" w:color="000000"/>
+            </w:tcBorders>
+            <w:shd w:val="clear" w:color="auto" w:fill="FFFFFF"/>
+            <w:tcMar>
+              <w:top w:w="0" w:type="dxa"/>
+              <w:bottom w:w="0" w:type="dxa"/>
+              <w:left w:w="0" w:type="dxa"/>
+              <w:right w:w="0" w:type="dxa"/>
+            </w:tcMar>
+            <w:vAlign w:val="center"/>
+          </w:tcPr>
+          <w:p>
+            <w:pPr>
+              <w:pStyle w:val="Normal"/>
+              <w:jc w:val="center"/>
+              <w:pBdr>
+                <w:bottom w:val="none" w:sz="0" w:space="0" w:color="000000"/>
+                <w:top w:val="none" w:sz="0" w:space="0" w:color="000000"/>
+                <w:left w:val="none" w:sz="0" w:space="0" w:color="000000"/>
+                <w:right w:val="none" w:sz="0" w:space="0" w:color="000000"/>
+              </w:pBdr>
+              <w:spacing w:after="100" w:before="100" w:line="240"/>
+              <w:ind w:left="100" w:right="100" w:firstLine="0" w:firstLineChars="0"/>
+            </w:pPr>
+            <w:r>
+              <w:rPr>
+                <w:rFonts w:ascii="Helvetica" w:hAnsi="Helvetica" w:eastAsia="Helvetica" w:cs="Helvetica"/>
+                <w:i w:val="false"/>
+                <w:b w:val="false"/>
+                <w:u w:val="none"/>
+                <w:sz w:val="22"/>
+                <w:szCs w:val="22"/>
+                <w:color w:val="000000"/>
+              </w:rPr>
+              <w:t xml:space="preserve">1.15 ± 1.09</w:t>
+            </w:r>
+          </w:p>
+        </w:tc>
+        <w:tc>
+          <w:tcPr>
+            <w:tcBorders>
+              <w:bottom w:val="none" w:sz="0" w:space="0" w:color="000000"/>
+              <w:top w:val="none" w:sz="0" w:space="0" w:color="000000"/>
+              <w:left w:val="none" w:sz="0" w:space="0" w:color="000000"/>
+              <w:right w:val="none" w:sz="0" w:space="0" w:color="000000"/>
+            </w:tcBorders>
+            <w:shd w:val="clear" w:color="auto" w:fill="FFFFFF"/>
+            <w:tcMar>
+              <w:top w:w="0" w:type="dxa"/>
+              <w:bottom w:w="0" w:type="dxa"/>
+              <w:left w:w="0" w:type="dxa"/>
+              <w:right w:w="0" w:type="dxa"/>
+            </w:tcMar>
+            <w:vAlign w:val="center"/>
+          </w:tcPr>
+          <w:p>
+            <w:pPr>
+              <w:pStyle w:val="Normal"/>
+              <w:jc w:val="center"/>
+              <w:pBdr>
+                <w:bottom w:val="none" w:sz="0" w:space="0" w:color="000000"/>
+                <w:top w:val="none" w:sz="0" w:space="0" w:color="000000"/>
+                <w:left w:val="none" w:sz="0" w:space="0" w:color="000000"/>
+                <w:right w:val="none" w:sz="0" w:space="0" w:color="000000"/>
+              </w:pBdr>
+              <w:spacing w:after="100" w:before="100" w:line="240"/>
+              <w:ind w:left="100" w:right="100" w:firstLine="0" w:firstLineChars="0"/>
+            </w:pPr>
+            <w:r>
+              <w:rPr>
+                <w:rFonts w:ascii="Helvetica" w:hAnsi="Helvetica" w:eastAsia="Helvetica" w:cs="Helvetica"/>
+                <w:i w:val="false"/>
+                <w:b w:val="false"/>
+                <w:u w:val="none"/>
+                <w:sz w:val="22"/>
+                <w:szCs w:val="22"/>
+                <w:color w:val="000000"/>
+              </w:rPr>
+              <w:t xml:space="preserve">2.67 ± 2.14</w:t>
+            </w:r>
+          </w:p>
+        </w:tc>
+        <w:tc>
+          <w:tcPr>
+            <w:tcBorders>
+              <w:bottom w:val="none" w:sz="0" w:space="0" w:color="000000"/>
+              <w:top w:val="none" w:sz="0" w:space="0" w:color="000000"/>
+              <w:left w:val="none" w:sz="0" w:space="0" w:color="000000"/>
+              <w:right w:val="none" w:sz="0" w:space="0" w:color="000000"/>
+            </w:tcBorders>
+            <w:shd w:val="clear" w:color="auto" w:fill="FFFFFF"/>
+            <w:tcMar>
+              <w:top w:w="0" w:type="dxa"/>
+              <w:bottom w:w="0" w:type="dxa"/>
+              <w:left w:w="0" w:type="dxa"/>
+              <w:right w:w="0" w:type="dxa"/>
+            </w:tcMar>
+            <w:vAlign w:val="center"/>
+          </w:tcPr>
+          <w:p>
+            <w:pPr>
+              <w:pStyle w:val="Normal"/>
+              <w:jc w:val="center"/>
+              <w:pBdr>
+                <w:bottom w:val="none" w:sz="0" w:space="0" w:color="000000"/>
+                <w:top w:val="none" w:sz="0" w:space="0" w:color="000000"/>
+                <w:left w:val="none" w:sz="0" w:space="0" w:color="000000"/>
+                <w:right w:val="none" w:sz="0" w:space="0" w:color="000000"/>
+              </w:pBdr>
+              <w:spacing w:after="100" w:before="100" w:line="240"/>
+              <w:ind w:left="100" w:right="100" w:firstLine="0" w:firstLineChars="0"/>
+            </w:pPr>
+            <w:r>
+              <w:rPr>
+                <w:rFonts w:ascii="Helvetica" w:hAnsi="Helvetica" w:eastAsia="Helvetica" w:cs="Helvetica"/>
+                <w:i w:val="false"/>
+                <w:b w:val="false"/>
+                <w:u w:val="none"/>
+                <w:sz w:val="22"/>
+                <w:szCs w:val="22"/>
+                <w:color w:val="000000"/>
+              </w:rPr>
+              <w:t xml:space="preserve">0.012 (Wilcoxon)</w:t>
+            </w:r>
+          </w:p>
+        </w:tc>
+      </w:tr>
+      <w:tr>
+        <w:trPr>
+          <w:trHeight w:val="616" w:hRule="auto"/>
+        </w:trPr>
+        body43
         <w:tc>
           <w:tcPr>
             <w:tcBorders>

</xml_diff>